<commit_message>
Move Team Lab image above author name
</commit_message>
<xml_diff>
--- a/content/Team-Lab-Phenomena.docx
+++ b/content/Team-Lab-Phenomena.docx
@@ -5542,25 +5542,7 @@
     </w:p>
     <w:p>
       <w:pPr>
-        <w:rPr>
-          <w:b/>
-          <w:bCs/>
-          <w:color w:val="0F9ED5" w:themeColor="accent4"/>
-          <w:sz w:val="32"/>
-          <w:szCs w:val="32"/>
-          <w:cs/>
-          <w:lang w:bidi="hi-IN"/>
-          <w14:textOutline w14:w="0" w14:cap="flat" w14:cmpd="sng" w14:algn="ctr">
-            <w14:noFill/>
-            <w14:prstDash w14:val="solid"/>
-            <w14:round/>
-          </w14:textOutline>
-          <w14:props3d w14:extrusionH="57150" w14:contourW="0" w14:prstMaterial="softEdge">
-            <w14:bevelT w14:w="25400" w14:h="38100" w14:prst="circle"/>
-          </w14:props3d>
-        </w:rPr>
-      </w:pPr>
-      <w:r>
+        <w:jc w:val="center"/>
         <w:rPr>
           <w:bCs/>
           <w:outline/>
@@ -5584,72 +5566,23 @@
             </w14:solidFill>
           </w14:textFill>
         </w:rPr>
-        <w:t xml:space="preserve">                                                                                         </w:t>
-      </w:r>
-      <w:r>
-        <w:rPr>
-          <w:rFonts w:hint="cs"/>
-          <w:b/>
+      </w:pPr>
+      <w:r>
+        <w:rPr>
           <w:bCs/>
-          <w:color w:val="0F9ED5" w:themeColor="accent4"/>
+          <w:outline/>
+          <w:noProof/>
+          <w:color w:val="FFFFFF"/>
           <w:sz w:val="32"/>
           <w:szCs w:val="32"/>
-          <w:cs/>
-          <w:lang w:bidi="hi-IN"/>
-          <w14:textOutline w14:w="0" w14:cap="flat" w14:cmpd="sng" w14:algn="ctr">
-            <w14:noFill/>
-            <w14:prstDash w14:val="solid"/>
-            <w14:round/>
-          </w14:textOutline>
-          <w14:props3d w14:extrusionH="57150" w14:contourW="0" w14:prstMaterial="softEdge">
-            <w14:bevelT w14:w="25400" w14:h="38100" w14:prst="circle"/>
-          </w14:props3d>
-        </w:rPr>
-        <w:t>गीतांजलि सक्सेना</w:t>
-      </w:r>
-    </w:p>
-    <w:p>
-      <w:pPr>
-        <w:rPr>
-          <w:rFonts w:hint="cs"/>
-          <w:sz w:val="28"/>
-          <w:szCs w:val="28"/>
-          <w:cs/>
-          <w:lang w:bidi="hi-IN"/>
-        </w:rPr>
-      </w:pPr>
-      <w:r>
-        <w:rPr>
-          <w:rFonts w:hint="cs"/>
-          <w:sz w:val="28"/>
-          <w:szCs w:val="28"/>
-          <w:cs/>
-          <w:lang w:bidi="hi-IN"/>
-        </w:rPr>
-        <w:t xml:space="preserve">                          </w:t>
-      </w:r>
-    </w:p>
-    <w:p>
-      <w:pPr>
-        <w:jc w:val="center"/>
-        <w:rPr>
-          <w:sz w:val="28"/>
-          <w:szCs w:val="28"/>
-          <w:lang w:bidi="hi-IN"/>
-        </w:rPr>
-      </w:pPr>
-      <w:r>
-        <w:rPr>
-          <w:noProof/>
-          <w:sz w:val="28"/>
-          <w:szCs w:val="28"/>
-          <w:lang w:val="hi-IN" w:bidi="hi-IN"/>
-        </w:rPr>
+          <w:lang w:bidi="hi-IN"/>
+        </w:rPr>
+        <w:lastRenderedPageBreak/>
         <w:drawing>
-          <wp:inline distT="0" distB="0" distL="0" distR="0" wp14:anchorId="06D54DF2" wp14:editId="09441E19">
-            <wp:extent cx="5461000" cy="7281333"/>
+          <wp:inline distT="0" distB="0" distL="0" distR="0" wp14:anchorId="481559EE" wp14:editId="62D9ED90">
+            <wp:extent cx="2794000" cy="1303867"/>
             <wp:effectExtent l="0" t="0" r="6350" b="0"/>
-            <wp:docPr id="1838276415" name="Graphic 1"/>
+            <wp:docPr id="476529727" name="Graphic 1"/>
             <wp:cNvGraphicFramePr>
               <a:graphicFrameLocks xmlns:a="http://schemas.openxmlformats.org/drawingml/2006/main" noChangeAspect="1"/>
             </wp:cNvGraphicFramePr>
@@ -5657,7 +5590,7 @@
               <a:graphicData uri="http://schemas.openxmlformats.org/drawingml/2006/picture">
                 <pic:pic xmlns:pic="http://schemas.openxmlformats.org/drawingml/2006/picture">
                   <pic:nvPicPr>
-                    <pic:cNvPr id="1838276415" name=""/>
+                    <pic:cNvPr id="476529727" name=""/>
                     <pic:cNvPicPr/>
                   </pic:nvPicPr>
                   <pic:blipFill>
@@ -5675,7 +5608,7 @@
                   <pic:spPr>
                     <a:xfrm>
                       <a:off x="0" y="0"/>
-                      <a:ext cx="5461000" cy="7281333"/>
+                      <a:ext cx="2794000" cy="1303867"/>
                     </a:xfrm>
                     <a:prstGeom prst="rect">
                       <a:avLst/>
@@ -5690,14 +5623,92 @@
     </w:p>
     <w:p>
       <w:pPr>
-        <w:jc w:val="center"/>
-        <w:rPr>
-          <w:sz w:val="28"/>
-          <w:szCs w:val="28"/>
-          <w:cs/>
-          <w:lang w:bidi="hi-IN"/>
+        <w:jc w:val="right"/>
+        <w:rPr>
+          <w:b/>
+          <w:bCs/>
+          <w:color w:val="0F9ED5" w:themeColor="accent4"/>
+          <w:sz w:val="32"/>
+          <w:szCs w:val="32"/>
+          <w:cs/>
+          <w:lang w:bidi="hi-IN"/>
+          <w14:textOutline w14:w="0" w14:cap="flat" w14:cmpd="sng" w14:algn="ctr">
+            <w14:noFill/>
+            <w14:prstDash w14:val="solid"/>
+            <w14:round/>
+          </w14:textOutline>
+          <w14:props3d w14:extrusionH="57150" w14:contourW="0" w14:prstMaterial="softEdge">
+            <w14:bevelT w14:w="25400" w14:h="38100" w14:prst="circle"/>
+          </w14:props3d>
         </w:rPr>
       </w:pPr>
+      <w:r>
+        <w:rPr>
+          <w:bCs/>
+          <w:outline/>
+          <w:color w:val="E97132" w:themeColor="accent2"/>
+          <w:sz w:val="32"/>
+          <w:szCs w:val="32"/>
+          <w:lang w:bidi="hi-IN"/>
+          <w14:shadow w14:blurRad="0" w14:dist="38100" w14:dir="2700000" w14:sx="100000" w14:sy="100000" w14:kx="0" w14:ky="0" w14:algn="tl">
+            <w14:schemeClr w14:val="accent2"/>
+          </w14:shadow>
+          <w14:textOutline w14:w="6604" w14:cap="flat" w14:cmpd="sng" w14:algn="ctr">
+            <w14:solidFill>
+              <w14:schemeClr w14:val="accent2"/>
+            </w14:solidFill>
+            <w14:prstDash w14:val="solid"/>
+            <w14:round/>
+          </w14:textOutline>
+          <w14:textFill>
+            <w14:solidFill>
+              <w14:srgbClr w14:val="FFFFFF"/>
+            </w14:solidFill>
+          </w14:textFill>
+        </w:rPr>
+        <w:t xml:space="preserve">                                                                                         </w:t>
+      </w:r>
+      <w:r>
+        <w:rPr>
+          <w:rFonts w:hint="cs"/>
+          <w:b/>
+          <w:bCs/>
+          <w:color w:val="0F9ED5" w:themeColor="accent4"/>
+          <w:sz w:val="32"/>
+          <w:szCs w:val="32"/>
+          <w:cs/>
+          <w:lang w:bidi="hi-IN"/>
+          <w14:textOutline w14:w="0" w14:cap="flat" w14:cmpd="sng" w14:algn="ctr">
+            <w14:noFill/>
+            <w14:prstDash w14:val="solid"/>
+            <w14:round/>
+          </w14:textOutline>
+          <w14:props3d w14:extrusionH="57150" w14:contourW="0" w14:prstMaterial="softEdge">
+            <w14:bevelT w14:w="25400" w14:h="38100" w14:prst="circle"/>
+          </w14:props3d>
+        </w:rPr>
+        <w:t>गीतांजलि सक्सेना</w:t>
+      </w:r>
+    </w:p>
+    <w:p>
+      <w:pPr>
+        <w:rPr>
+          <w:sz w:val="28"/>
+          <w:szCs w:val="28"/>
+          <w:cs/>
+          <w:lang w:bidi="hi-IN"/>
+        </w:rPr>
+      </w:pPr>
+      <w:r>
+        <w:rPr>
+          <w:rFonts w:hint="cs"/>
+          <w:sz w:val="28"/>
+          <w:szCs w:val="28"/>
+          <w:cs/>
+          <w:lang w:bidi="hi-IN"/>
+        </w:rPr>
+        <w:t xml:space="preserve">                          </w:t>
+      </w:r>
     </w:p>
     <w:sectPr>
       <w:pgSz w:w="12240" w:h="15840"/>

</xml_diff>

<commit_message>
Remove inside article Team Lab image
</commit_message>
<xml_diff>
--- a/content/Team-Lab-Phenomena.docx
+++ b/content/Team-Lab-Phenomena.docx
@@ -1335,6 +1335,7 @@
         </w:rPr>
         <w:t xml:space="preserve"> </w:t>
       </w:r>
+      <w:proofErr w:type="spellStart"/>
       <w:r>
         <w:rPr>
           <w:rFonts w:hint="cs"/>
@@ -1345,6 +1346,7 @@
         </w:rPr>
         <w:t>इन्सानी</w:t>
       </w:r>
+      <w:proofErr w:type="spellEnd"/>
       <w:r>
         <w:rPr>
           <w:rFonts w:hint="cs"/>
@@ -1495,6 +1497,7 @@
         </w:rPr>
         <w:t xml:space="preserve"> </w:t>
       </w:r>
+      <w:proofErr w:type="spellStart"/>
       <w:r>
         <w:rPr>
           <w:rFonts w:hint="cs"/>
@@ -1573,8 +1576,9 @@
             </w14:gradFill>
           </w14:textFill>
         </w:rPr>
-        <w:t xml:space="preserve">धाबी </w:t>
-      </w:r>
+        <w:t>धाबी</w:t>
+      </w:r>
+      <w:proofErr w:type="spellEnd"/>
       <w:r>
         <w:rPr>
           <w:rFonts w:hint="cs"/>
@@ -1613,7 +1617,7 @@
             </w14:gradFill>
           </w14:textFill>
         </w:rPr>
-        <w:t>स्थित</w:t>
+        <w:t xml:space="preserve"> </w:t>
       </w:r>
       <w:r>
         <w:rPr>
@@ -1653,7 +1657,7 @@
             </w14:gradFill>
           </w14:textFill>
         </w:rPr>
-        <w:t xml:space="preserve"> डिजिटल कला </w:t>
+        <w:t>स्थित</w:t>
       </w:r>
       <w:r>
         <w:rPr>
@@ -1693,7 +1697,7 @@
             </w14:gradFill>
           </w14:textFill>
         </w:rPr>
-        <w:t>संग्रहालय</w:t>
+        <w:t xml:space="preserve"> डिजिटल कला </w:t>
       </w:r>
       <w:r>
         <w:rPr>
@@ -1733,15 +1737,17 @@
             </w14:gradFill>
           </w14:textFill>
         </w:rPr>
-        <w:t xml:space="preserve"> </w:t>
-      </w:r>
-      <w:r>
-        <w:rPr>
+        <w:t>संग्रहालय</w:t>
+      </w:r>
+      <w:r>
+        <w:rPr>
+          <w:rFonts w:hint="cs"/>
           <w:b/>
           <w:bCs/>
           <w:color w:val="E97132" w:themeColor="accent2"/>
           <w:sz w:val="28"/>
           <w:szCs w:val="28"/>
+          <w:cs/>
           <w:lang w:bidi="hi-IN"/>
           <w14:reflection w14:blurRad="6350" w14:stA="53000" w14:stPos="0" w14:endA="300" w14:endPos="35500" w14:dist="0" w14:dir="5400000" w14:fadeDir="5400000" w14:sx="100000" w14:sy="-90000" w14:kx="0" w14:ky="0" w14:algn="bl"/>
           <w14:textOutline w14:w="0" w14:cap="flat" w14:cmpd="sng" w14:algn="ctr">
@@ -1771,7 +1777,7 @@
             </w14:gradFill>
           </w14:textFill>
         </w:rPr>
-        <w:t>(</w:t>
+        <w:t xml:space="preserve"> </w:t>
       </w:r>
       <w:r>
         <w:rPr>
@@ -1809,10 +1815,12 @@
             </w14:gradFill>
           </w14:textFill>
         </w:rPr>
-        <w:t>Team Lab</w:t>
-      </w:r>
-      <w:r>
-        <w:rPr>
+        <w:t>(</w:t>
+      </w:r>
+      <w:r>
+        <w:rPr>
+          <w:b/>
+          <w:bCs/>
           <w:color w:val="E97132" w:themeColor="accent2"/>
           <w:sz w:val="28"/>
           <w:szCs w:val="28"/>
@@ -1845,12 +1853,10 @@
             </w14:gradFill>
           </w14:textFill>
         </w:rPr>
-        <w:t xml:space="preserve"> </w:t>
-      </w:r>
-      <w:r>
-        <w:rPr>
-          <w:b/>
-          <w:bCs/>
+        <w:t>Team Lab</w:t>
+      </w:r>
+      <w:r>
+        <w:rPr>
           <w:color w:val="E97132" w:themeColor="accent2"/>
           <w:sz w:val="28"/>
           <w:szCs w:val="28"/>
@@ -1883,7 +1889,7 @@
             </w14:gradFill>
           </w14:textFill>
         </w:rPr>
-        <w:t>Phenomena)</w:t>
+        <w:t xml:space="preserve"> </w:t>
       </w:r>
       <w:r>
         <w:rPr>
@@ -1921,17 +1927,15 @@
             </w14:gradFill>
           </w14:textFill>
         </w:rPr>
-        <w:t xml:space="preserve"> </w:t>
-      </w:r>
-      <w:r>
-        <w:rPr>
-          <w:rFonts w:hint="cs"/>
+        <w:t>Phenomena)</w:t>
+      </w:r>
+      <w:r>
+        <w:rPr>
           <w:b/>
           <w:bCs/>
           <w:color w:val="E97132" w:themeColor="accent2"/>
           <w:sz w:val="28"/>
           <w:szCs w:val="28"/>
-          <w:cs/>
           <w:lang w:bidi="hi-IN"/>
           <w14:reflection w14:blurRad="6350" w14:stA="53000" w14:stPos="0" w14:endA="300" w14:endPos="35500" w14:dist="0" w14:dir="5400000" w14:fadeDir="5400000" w14:sx="100000" w14:sy="-90000" w14:kx="0" w14:ky="0" w14:algn="bl"/>
           <w14:textOutline w14:w="0" w14:cap="flat" w14:cmpd="sng" w14:algn="ctr">
@@ -1966,23 +1970,6 @@
       <w:r>
         <w:rPr>
           <w:rFonts w:hint="cs"/>
-          <w:color w:val="501549" w:themeColor="accent5" w:themeShade="80"/>
-          <w:sz w:val="28"/>
-          <w:szCs w:val="28"/>
-          <w:cs/>
-          <w:lang w:bidi="hi-IN"/>
-          <w14:reflection w14:blurRad="6350" w14:stA="53000" w14:stPos="0" w14:endA="300" w14:endPos="35500" w14:dist="0" w14:dir="5400000" w14:fadeDir="5400000" w14:sx="100000" w14:sy="-90000" w14:kx="0" w14:ky="0" w14:algn="bl"/>
-          <w14:textOutline w14:w="0" w14:cap="flat" w14:cmpd="sng" w14:algn="ctr">
-            <w14:noFill/>
-            <w14:prstDash w14:val="solid"/>
-            <w14:round/>
-          </w14:textOutline>
-        </w:rPr>
-        <w:t>ने</w:t>
-      </w:r>
-      <w:r>
-        <w:rPr>
-          <w:rFonts w:hint="cs"/>
           <w:b/>
           <w:bCs/>
           <w:color w:val="E97132" w:themeColor="accent2"/>
@@ -2023,479 +2010,29 @@
       <w:r>
         <w:rPr>
           <w:rFonts w:hint="cs"/>
-          <w:sz w:val="28"/>
-          <w:szCs w:val="28"/>
-          <w:cs/>
-          <w:lang w:bidi="hi-IN"/>
-        </w:rPr>
-        <w:t>आज</w:t>
-      </w:r>
-      <w:r>
-        <w:rPr>
-          <w:rFonts w:hint="cs"/>
-          <w:sz w:val="28"/>
-          <w:szCs w:val="28"/>
-          <w:cs/>
-          <w:lang w:bidi="hi-IN"/>
-        </w:rPr>
-        <w:t xml:space="preserve"> के</w:t>
-      </w:r>
-      <w:r>
-        <w:rPr>
-          <w:rFonts w:hint="cs"/>
-          <w:sz w:val="28"/>
-          <w:szCs w:val="28"/>
-          <w:cs/>
-          <w:lang w:bidi="hi-IN"/>
-        </w:rPr>
-        <w:t xml:space="preserve"> डिजिटल</w:t>
-      </w:r>
-      <w:r>
-        <w:rPr>
-          <w:rFonts w:hint="cs"/>
-          <w:sz w:val="28"/>
-          <w:szCs w:val="28"/>
-          <w:cs/>
-          <w:lang w:bidi="hi-IN"/>
-        </w:rPr>
-        <w:t xml:space="preserve"> दौर में</w:t>
-      </w:r>
-      <w:r>
-        <w:rPr>
-          <w:rFonts w:hint="cs"/>
-          <w:sz w:val="28"/>
-          <w:szCs w:val="28"/>
-          <w:cs/>
-          <w:lang w:bidi="hi-IN"/>
-        </w:rPr>
-        <w:t xml:space="preserve"> यह</w:t>
-      </w:r>
-      <w:r>
-        <w:rPr>
-          <w:rFonts w:hint="cs"/>
-          <w:sz w:val="28"/>
-          <w:szCs w:val="28"/>
-          <w:cs/>
-          <w:lang w:bidi="hi-IN"/>
-        </w:rPr>
-        <w:t xml:space="preserve"> साबित कर </w:t>
-      </w:r>
-      <w:r>
-        <w:rPr>
-          <w:rFonts w:hint="cs"/>
-          <w:sz w:val="28"/>
-          <w:szCs w:val="28"/>
-          <w:cs/>
-          <w:lang w:bidi="hi-IN"/>
-        </w:rPr>
-        <w:t>दिखाया कि</w:t>
-      </w:r>
-      <w:r>
-        <w:rPr>
-          <w:rFonts w:hint="cs"/>
-          <w:sz w:val="28"/>
-          <w:szCs w:val="28"/>
-          <w:cs/>
-          <w:lang w:bidi="hi-IN"/>
-        </w:rPr>
-        <w:t xml:space="preserve"> </w:t>
-      </w:r>
-      <w:r>
-        <w:rPr>
-          <w:rFonts w:hint="cs"/>
-          <w:sz w:val="28"/>
-          <w:szCs w:val="28"/>
-          <w:cs/>
-          <w:lang w:bidi="hi-IN"/>
-        </w:rPr>
-        <w:t xml:space="preserve">कैसे </w:t>
-      </w:r>
-      <w:r>
-        <w:rPr>
-          <w:rFonts w:hint="cs"/>
-          <w:sz w:val="28"/>
-          <w:szCs w:val="28"/>
-          <w:cs/>
-          <w:lang w:bidi="hi-IN"/>
-        </w:rPr>
-        <w:t>कला की</w:t>
-      </w:r>
-      <w:r>
-        <w:rPr>
-          <w:rFonts w:hint="cs"/>
-          <w:sz w:val="28"/>
-          <w:szCs w:val="28"/>
-          <w:cs/>
-          <w:lang w:bidi="hi-IN"/>
-        </w:rPr>
-        <w:t xml:space="preserve"> </w:t>
-      </w:r>
-      <w:r>
-        <w:rPr>
-          <w:rFonts w:hint="cs"/>
-          <w:sz w:val="28"/>
-          <w:szCs w:val="28"/>
-          <w:cs/>
-          <w:lang w:bidi="hi-IN"/>
-        </w:rPr>
-        <w:t>सीमाओं को</w:t>
-      </w:r>
-      <w:r>
-        <w:rPr>
-          <w:rFonts w:hint="cs"/>
-          <w:sz w:val="28"/>
-          <w:szCs w:val="28"/>
-          <w:cs/>
-          <w:lang w:bidi="hi-IN"/>
-        </w:rPr>
-        <w:t xml:space="preserve"> </w:t>
-      </w:r>
-      <w:r>
-        <w:rPr>
-          <w:rFonts w:hint="cs"/>
-          <w:sz w:val="28"/>
-          <w:szCs w:val="28"/>
-          <w:cs/>
-          <w:lang w:bidi="hi-IN"/>
-        </w:rPr>
-        <w:t xml:space="preserve">तोड़ते हुए </w:t>
-      </w:r>
-      <w:r>
-        <w:rPr>
-          <w:rFonts w:hint="cs"/>
-          <w:sz w:val="28"/>
-          <w:szCs w:val="28"/>
-          <w:cs/>
-          <w:lang w:bidi="hi-IN"/>
-        </w:rPr>
-        <w:t xml:space="preserve">ऐसी दुनिया की </w:t>
-      </w:r>
-      <w:r>
-        <w:rPr>
-          <w:rFonts w:hint="cs"/>
-          <w:sz w:val="28"/>
-          <w:szCs w:val="28"/>
-          <w:cs/>
-          <w:lang w:bidi="hi-IN"/>
-        </w:rPr>
-        <w:t xml:space="preserve">तस्वीरें </w:t>
-      </w:r>
-      <w:r>
-        <w:rPr>
-          <w:rFonts w:hint="cs"/>
-          <w:sz w:val="28"/>
-          <w:szCs w:val="28"/>
-          <w:cs/>
-          <w:lang w:bidi="hi-IN"/>
-        </w:rPr>
-        <w:t>उजागर</w:t>
-      </w:r>
-      <w:r>
-        <w:rPr>
-          <w:rFonts w:hint="cs"/>
-          <w:sz w:val="28"/>
-          <w:szCs w:val="28"/>
-          <w:cs/>
-          <w:lang w:bidi="hi-IN"/>
-        </w:rPr>
-        <w:t xml:space="preserve"> </w:t>
-      </w:r>
-      <w:r>
-        <w:rPr>
-          <w:rFonts w:hint="cs"/>
-          <w:sz w:val="28"/>
-          <w:szCs w:val="28"/>
-          <w:cs/>
-          <w:lang w:bidi="hi-IN"/>
-        </w:rPr>
-        <w:t>कैसे</w:t>
-      </w:r>
-      <w:r>
-        <w:rPr>
-          <w:rFonts w:hint="cs"/>
-          <w:sz w:val="28"/>
-          <w:szCs w:val="28"/>
-          <w:cs/>
-          <w:lang w:bidi="hi-IN"/>
-        </w:rPr>
-        <w:t xml:space="preserve"> </w:t>
-      </w:r>
-      <w:r>
-        <w:rPr>
-          <w:rFonts w:hint="cs"/>
-          <w:sz w:val="28"/>
-          <w:szCs w:val="28"/>
-          <w:cs/>
-          <w:lang w:bidi="hi-IN"/>
-        </w:rPr>
-        <w:t xml:space="preserve">हो </w:t>
-      </w:r>
-      <w:r>
-        <w:rPr>
-          <w:rFonts w:hint="cs"/>
-          <w:sz w:val="28"/>
-          <w:szCs w:val="28"/>
-          <w:cs/>
-          <w:lang w:bidi="hi-IN"/>
-        </w:rPr>
-        <w:t>सकती</w:t>
-      </w:r>
-      <w:r>
-        <w:rPr>
-          <w:rFonts w:hint="cs"/>
-          <w:sz w:val="28"/>
-          <w:szCs w:val="28"/>
-          <w:cs/>
-          <w:lang w:bidi="hi-IN"/>
-        </w:rPr>
-        <w:t xml:space="preserve"> है</w:t>
-      </w:r>
-      <w:r>
-        <w:rPr>
-          <w:rFonts w:hint="cs"/>
-          <w:sz w:val="28"/>
-          <w:szCs w:val="28"/>
-          <w:cs/>
-          <w:lang w:bidi="hi-IN"/>
-        </w:rPr>
-        <w:t xml:space="preserve">। </w:t>
-      </w:r>
-      <w:r>
-        <w:rPr>
-          <w:rFonts w:hint="cs"/>
-          <w:sz w:val="28"/>
-          <w:szCs w:val="28"/>
-          <w:cs/>
-          <w:lang w:bidi="hi-IN"/>
-        </w:rPr>
-        <w:t xml:space="preserve">इस </w:t>
-      </w:r>
-      <w:r>
-        <w:rPr>
-          <w:rFonts w:hint="cs"/>
-          <w:sz w:val="28"/>
-          <w:szCs w:val="28"/>
-          <w:cs/>
-          <w:lang w:bidi="hi-IN"/>
-        </w:rPr>
-        <w:t xml:space="preserve">प्रदर्शनी </w:t>
-      </w:r>
-      <w:r>
-        <w:rPr>
-          <w:rFonts w:hint="cs"/>
-          <w:sz w:val="28"/>
-          <w:szCs w:val="28"/>
-          <w:cs/>
-          <w:lang w:bidi="hi-IN"/>
-        </w:rPr>
-        <w:t>की खूबसूरती में</w:t>
-      </w:r>
-      <w:r>
-        <w:rPr>
-          <w:rFonts w:hint="cs"/>
-          <w:sz w:val="28"/>
-          <w:szCs w:val="28"/>
-          <w:cs/>
-          <w:lang w:bidi="hi-IN"/>
-        </w:rPr>
-        <w:t xml:space="preserve"> चार चांद</w:t>
-      </w:r>
-      <w:r>
-        <w:rPr>
-          <w:rFonts w:hint="cs"/>
-          <w:sz w:val="28"/>
-          <w:szCs w:val="28"/>
-          <w:cs/>
-          <w:lang w:bidi="hi-IN"/>
-        </w:rPr>
-        <w:t xml:space="preserve"> और लग जाते</w:t>
-      </w:r>
-      <w:r>
-        <w:rPr>
-          <w:rFonts w:hint="cs"/>
-          <w:sz w:val="28"/>
-          <w:szCs w:val="28"/>
-          <w:cs/>
-          <w:lang w:bidi="hi-IN"/>
-        </w:rPr>
-        <w:t xml:space="preserve"> हैं</w:t>
-      </w:r>
-      <w:r>
-        <w:rPr>
-          <w:rFonts w:hint="cs"/>
-          <w:sz w:val="28"/>
-          <w:szCs w:val="28"/>
-          <w:cs/>
-          <w:lang w:bidi="hi-IN"/>
-        </w:rPr>
-        <w:t>,</w:t>
-      </w:r>
-      <w:r>
-        <w:rPr>
-          <w:rFonts w:hint="cs"/>
-          <w:sz w:val="28"/>
-          <w:szCs w:val="28"/>
-          <w:cs/>
-          <w:lang w:bidi="hi-IN"/>
-        </w:rPr>
-        <w:t xml:space="preserve"> जहां</w:t>
-      </w:r>
-      <w:r>
-        <w:rPr>
-          <w:rFonts w:hint="cs"/>
-          <w:sz w:val="28"/>
-          <w:szCs w:val="28"/>
-          <w:cs/>
-          <w:lang w:bidi="hi-IN"/>
-        </w:rPr>
-        <w:t xml:space="preserve"> प्र</w:t>
-      </w:r>
-      <w:r>
-        <w:rPr>
-          <w:rFonts w:hint="cs"/>
-          <w:sz w:val="28"/>
-          <w:szCs w:val="28"/>
-          <w:cs/>
-          <w:lang w:bidi="hi-IN"/>
-        </w:rPr>
-        <w:t>वे</w:t>
-      </w:r>
-      <w:r>
-        <w:rPr>
-          <w:rFonts w:hint="cs"/>
-          <w:sz w:val="28"/>
-          <w:szCs w:val="28"/>
-          <w:cs/>
-          <w:lang w:bidi="hi-IN"/>
-        </w:rPr>
-        <w:t>श करते ही</w:t>
-      </w:r>
-      <w:r>
-        <w:rPr>
-          <w:rFonts w:hint="cs"/>
-          <w:sz w:val="28"/>
-          <w:szCs w:val="28"/>
-          <w:cs/>
-          <w:lang w:bidi="hi-IN"/>
-        </w:rPr>
-        <w:t xml:space="preserve"> दर्शक</w:t>
-      </w:r>
-      <w:r>
-        <w:rPr>
-          <w:rFonts w:hint="cs"/>
-          <w:sz w:val="28"/>
-          <w:szCs w:val="28"/>
-          <w:cs/>
-          <w:lang w:bidi="hi-IN"/>
-        </w:rPr>
-        <w:t xml:space="preserve"> </w:t>
-      </w:r>
-      <w:r>
-        <w:rPr>
-          <w:rFonts w:hint="cs"/>
-          <w:sz w:val="28"/>
-          <w:szCs w:val="28"/>
-          <w:cs/>
-          <w:lang w:bidi="hi-IN"/>
-        </w:rPr>
-        <w:t>भी</w:t>
-      </w:r>
-      <w:r>
-        <w:rPr>
-          <w:rFonts w:hint="cs"/>
-          <w:sz w:val="28"/>
-          <w:szCs w:val="28"/>
-          <w:cs/>
-          <w:lang w:bidi="hi-IN"/>
-        </w:rPr>
-        <w:t xml:space="preserve"> अपने स्पर्श से</w:t>
-      </w:r>
-      <w:r>
-        <w:rPr>
-          <w:rFonts w:hint="cs"/>
-          <w:sz w:val="28"/>
-          <w:szCs w:val="28"/>
-          <w:cs/>
-          <w:lang w:bidi="hi-IN"/>
-        </w:rPr>
-        <w:t xml:space="preserve"> उन सब </w:t>
-      </w:r>
-      <w:r>
-        <w:rPr>
-          <w:rFonts w:hint="cs"/>
-          <w:sz w:val="28"/>
-          <w:szCs w:val="28"/>
-          <w:cs/>
-          <w:lang w:bidi="hi-IN"/>
-        </w:rPr>
-        <w:t xml:space="preserve">कलात्मक प्रदर्शन का </w:t>
-      </w:r>
-      <w:r>
-        <w:rPr>
-          <w:rFonts w:hint="cs"/>
-          <w:sz w:val="28"/>
-          <w:szCs w:val="28"/>
-          <w:cs/>
-          <w:lang w:bidi="hi-IN"/>
-        </w:rPr>
-        <w:t>हिस्सा बना रह</w:t>
-      </w:r>
-      <w:r>
-        <w:rPr>
-          <w:rFonts w:hint="cs"/>
-          <w:sz w:val="28"/>
-          <w:szCs w:val="28"/>
-          <w:cs/>
-          <w:lang w:bidi="hi-IN"/>
-        </w:rPr>
-        <w:t>त</w:t>
-      </w:r>
-      <w:r>
-        <w:rPr>
-          <w:rFonts w:hint="cs"/>
-          <w:sz w:val="28"/>
-          <w:szCs w:val="28"/>
-          <w:cs/>
-          <w:lang w:bidi="hi-IN"/>
-        </w:rPr>
-        <w:t>े</w:t>
-      </w:r>
-      <w:r>
-        <w:rPr>
-          <w:rFonts w:hint="cs"/>
-          <w:sz w:val="28"/>
-          <w:szCs w:val="28"/>
-          <w:cs/>
-          <w:lang w:bidi="hi-IN"/>
-        </w:rPr>
-        <w:t xml:space="preserve"> है</w:t>
-      </w:r>
-      <w:r>
-        <w:rPr>
-          <w:rFonts w:hint="cs"/>
-          <w:sz w:val="28"/>
-          <w:szCs w:val="28"/>
-          <w:cs/>
-          <w:lang w:bidi="hi-IN"/>
-        </w:rPr>
-        <w:t>ं</w:t>
-      </w:r>
-      <w:r>
-        <w:rPr>
-          <w:rFonts w:hint="cs"/>
-          <w:sz w:val="28"/>
-          <w:szCs w:val="28"/>
-          <w:cs/>
-          <w:lang w:bidi="hi-IN"/>
-        </w:rPr>
-        <w:t>।</w:t>
-      </w:r>
-    </w:p>
-    <w:p>
-      <w:pPr>
-        <w:rPr>
-          <w:sz w:val="28"/>
-          <w:szCs w:val="28"/>
+          <w:color w:val="501549" w:themeColor="accent5" w:themeShade="80"/>
+          <w:sz w:val="28"/>
+          <w:szCs w:val="28"/>
+          <w:cs/>
+          <w:lang w:bidi="hi-IN"/>
+          <w14:reflection w14:blurRad="6350" w14:stA="53000" w14:stPos="0" w14:endA="300" w14:endPos="35500" w14:dist="0" w14:dir="5400000" w14:fadeDir="5400000" w14:sx="100000" w14:sy="-90000" w14:kx="0" w14:ky="0" w14:algn="bl"/>
+          <w14:textOutline w14:w="0" w14:cap="flat" w14:cmpd="sng" w14:algn="ctr">
+            <w14:noFill/>
+            <w14:prstDash w14:val="solid"/>
+            <w14:round/>
+          </w14:textOutline>
+        </w:rPr>
+        <w:t>ने</w:t>
+      </w:r>
+      <w:r>
+        <w:rPr>
+          <w:rFonts w:hint="cs"/>
+          <w:b/>
+          <w:bCs/>
+          <w:color w:val="E97132" w:themeColor="accent2"/>
+          <w:sz w:val="28"/>
+          <w:szCs w:val="28"/>
+          <w:cs/>
           <w:lang w:bidi="hi-IN"/>
           <w14:reflection w14:blurRad="6350" w14:stA="53000" w14:stPos="0" w14:endA="300" w14:endPos="35500" w14:dist="0" w14:dir="5400000" w14:fadeDir="5400000" w14:sx="100000" w14:sy="-90000" w14:kx="0" w14:ky="0" w14:algn="bl"/>
           <w14:textOutline w14:w="0" w14:cap="flat" w14:cmpd="sng" w14:algn="ctr">
@@ -2525,7 +2062,428 @@
             </w14:gradFill>
           </w14:textFill>
         </w:rPr>
-      </w:pPr>
+        <w:t xml:space="preserve"> </w:t>
+      </w:r>
+      <w:r>
+        <w:rPr>
+          <w:rFonts w:hint="cs"/>
+          <w:sz w:val="28"/>
+          <w:szCs w:val="28"/>
+          <w:cs/>
+          <w:lang w:bidi="hi-IN"/>
+        </w:rPr>
+        <w:t>आज</w:t>
+      </w:r>
+      <w:r>
+        <w:rPr>
+          <w:rFonts w:hint="cs"/>
+          <w:sz w:val="28"/>
+          <w:szCs w:val="28"/>
+          <w:cs/>
+          <w:lang w:bidi="hi-IN"/>
+        </w:rPr>
+        <w:t xml:space="preserve"> के</w:t>
+      </w:r>
+      <w:r>
+        <w:rPr>
+          <w:rFonts w:hint="cs"/>
+          <w:sz w:val="28"/>
+          <w:szCs w:val="28"/>
+          <w:cs/>
+          <w:lang w:bidi="hi-IN"/>
+        </w:rPr>
+        <w:t xml:space="preserve"> डिजिटल</w:t>
+      </w:r>
+      <w:r>
+        <w:rPr>
+          <w:rFonts w:hint="cs"/>
+          <w:sz w:val="28"/>
+          <w:szCs w:val="28"/>
+          <w:cs/>
+          <w:lang w:bidi="hi-IN"/>
+        </w:rPr>
+        <w:t xml:space="preserve"> दौर में</w:t>
+      </w:r>
+      <w:r>
+        <w:rPr>
+          <w:rFonts w:hint="cs"/>
+          <w:sz w:val="28"/>
+          <w:szCs w:val="28"/>
+          <w:cs/>
+          <w:lang w:bidi="hi-IN"/>
+        </w:rPr>
+        <w:t xml:space="preserve"> यह</w:t>
+      </w:r>
+      <w:r>
+        <w:rPr>
+          <w:rFonts w:hint="cs"/>
+          <w:sz w:val="28"/>
+          <w:szCs w:val="28"/>
+          <w:cs/>
+          <w:lang w:bidi="hi-IN"/>
+        </w:rPr>
+        <w:t xml:space="preserve"> साबित कर </w:t>
+      </w:r>
+      <w:r>
+        <w:rPr>
+          <w:rFonts w:hint="cs"/>
+          <w:sz w:val="28"/>
+          <w:szCs w:val="28"/>
+          <w:cs/>
+          <w:lang w:bidi="hi-IN"/>
+        </w:rPr>
+        <w:t>दिखाया कि</w:t>
+      </w:r>
+      <w:r>
+        <w:rPr>
+          <w:rFonts w:hint="cs"/>
+          <w:sz w:val="28"/>
+          <w:szCs w:val="28"/>
+          <w:cs/>
+          <w:lang w:bidi="hi-IN"/>
+        </w:rPr>
+        <w:t xml:space="preserve"> </w:t>
+      </w:r>
+      <w:r>
+        <w:rPr>
+          <w:rFonts w:hint="cs"/>
+          <w:sz w:val="28"/>
+          <w:szCs w:val="28"/>
+          <w:cs/>
+          <w:lang w:bidi="hi-IN"/>
+        </w:rPr>
+        <w:t xml:space="preserve">कैसे </w:t>
+      </w:r>
+      <w:r>
+        <w:rPr>
+          <w:rFonts w:hint="cs"/>
+          <w:sz w:val="28"/>
+          <w:szCs w:val="28"/>
+          <w:cs/>
+          <w:lang w:bidi="hi-IN"/>
+        </w:rPr>
+        <w:t>कला की</w:t>
+      </w:r>
+      <w:r>
+        <w:rPr>
+          <w:rFonts w:hint="cs"/>
+          <w:sz w:val="28"/>
+          <w:szCs w:val="28"/>
+          <w:cs/>
+          <w:lang w:bidi="hi-IN"/>
+        </w:rPr>
+        <w:t xml:space="preserve"> </w:t>
+      </w:r>
+      <w:r>
+        <w:rPr>
+          <w:rFonts w:hint="cs"/>
+          <w:sz w:val="28"/>
+          <w:szCs w:val="28"/>
+          <w:cs/>
+          <w:lang w:bidi="hi-IN"/>
+        </w:rPr>
+        <w:t>सीमाओं को</w:t>
+      </w:r>
+      <w:r>
+        <w:rPr>
+          <w:rFonts w:hint="cs"/>
+          <w:sz w:val="28"/>
+          <w:szCs w:val="28"/>
+          <w:cs/>
+          <w:lang w:bidi="hi-IN"/>
+        </w:rPr>
+        <w:t xml:space="preserve"> </w:t>
+      </w:r>
+      <w:r>
+        <w:rPr>
+          <w:rFonts w:hint="cs"/>
+          <w:sz w:val="28"/>
+          <w:szCs w:val="28"/>
+          <w:cs/>
+          <w:lang w:bidi="hi-IN"/>
+        </w:rPr>
+        <w:t xml:space="preserve">तोड़ते हुए </w:t>
+      </w:r>
+      <w:r>
+        <w:rPr>
+          <w:rFonts w:hint="cs"/>
+          <w:sz w:val="28"/>
+          <w:szCs w:val="28"/>
+          <w:cs/>
+          <w:lang w:bidi="hi-IN"/>
+        </w:rPr>
+        <w:t xml:space="preserve">ऐसी दुनिया की </w:t>
+      </w:r>
+      <w:r>
+        <w:rPr>
+          <w:rFonts w:hint="cs"/>
+          <w:sz w:val="28"/>
+          <w:szCs w:val="28"/>
+          <w:cs/>
+          <w:lang w:bidi="hi-IN"/>
+        </w:rPr>
+        <w:t xml:space="preserve">तस्वीरें </w:t>
+      </w:r>
+      <w:r>
+        <w:rPr>
+          <w:rFonts w:hint="cs"/>
+          <w:sz w:val="28"/>
+          <w:szCs w:val="28"/>
+          <w:cs/>
+          <w:lang w:bidi="hi-IN"/>
+        </w:rPr>
+        <w:t>उजागर</w:t>
+      </w:r>
+      <w:r>
+        <w:rPr>
+          <w:rFonts w:hint="cs"/>
+          <w:sz w:val="28"/>
+          <w:szCs w:val="28"/>
+          <w:cs/>
+          <w:lang w:bidi="hi-IN"/>
+        </w:rPr>
+        <w:t xml:space="preserve"> </w:t>
+      </w:r>
+      <w:r>
+        <w:rPr>
+          <w:rFonts w:hint="cs"/>
+          <w:sz w:val="28"/>
+          <w:szCs w:val="28"/>
+          <w:cs/>
+          <w:lang w:bidi="hi-IN"/>
+        </w:rPr>
+        <w:t>कैसे</w:t>
+      </w:r>
+      <w:r>
+        <w:rPr>
+          <w:rFonts w:hint="cs"/>
+          <w:sz w:val="28"/>
+          <w:szCs w:val="28"/>
+          <w:cs/>
+          <w:lang w:bidi="hi-IN"/>
+        </w:rPr>
+        <w:t xml:space="preserve"> </w:t>
+      </w:r>
+      <w:r>
+        <w:rPr>
+          <w:rFonts w:hint="cs"/>
+          <w:sz w:val="28"/>
+          <w:szCs w:val="28"/>
+          <w:cs/>
+          <w:lang w:bidi="hi-IN"/>
+        </w:rPr>
+        <w:t xml:space="preserve">हो </w:t>
+      </w:r>
+      <w:r>
+        <w:rPr>
+          <w:rFonts w:hint="cs"/>
+          <w:sz w:val="28"/>
+          <w:szCs w:val="28"/>
+          <w:cs/>
+          <w:lang w:bidi="hi-IN"/>
+        </w:rPr>
+        <w:t>सकती</w:t>
+      </w:r>
+      <w:r>
+        <w:rPr>
+          <w:rFonts w:hint="cs"/>
+          <w:sz w:val="28"/>
+          <w:szCs w:val="28"/>
+          <w:cs/>
+          <w:lang w:bidi="hi-IN"/>
+        </w:rPr>
+        <w:t xml:space="preserve"> है</w:t>
+      </w:r>
+      <w:r>
+        <w:rPr>
+          <w:rFonts w:hint="cs"/>
+          <w:sz w:val="28"/>
+          <w:szCs w:val="28"/>
+          <w:cs/>
+          <w:lang w:bidi="hi-IN"/>
+        </w:rPr>
+        <w:t xml:space="preserve">। </w:t>
+      </w:r>
+      <w:r>
+        <w:rPr>
+          <w:rFonts w:hint="cs"/>
+          <w:sz w:val="28"/>
+          <w:szCs w:val="28"/>
+          <w:cs/>
+          <w:lang w:bidi="hi-IN"/>
+        </w:rPr>
+        <w:t xml:space="preserve">इस </w:t>
+      </w:r>
+      <w:r>
+        <w:rPr>
+          <w:rFonts w:hint="cs"/>
+          <w:sz w:val="28"/>
+          <w:szCs w:val="28"/>
+          <w:cs/>
+          <w:lang w:bidi="hi-IN"/>
+        </w:rPr>
+        <w:t xml:space="preserve">प्रदर्शनी </w:t>
+      </w:r>
+      <w:r>
+        <w:rPr>
+          <w:rFonts w:hint="cs"/>
+          <w:sz w:val="28"/>
+          <w:szCs w:val="28"/>
+          <w:cs/>
+          <w:lang w:bidi="hi-IN"/>
+        </w:rPr>
+        <w:t>की खूबसूरती में</w:t>
+      </w:r>
+      <w:r>
+        <w:rPr>
+          <w:rFonts w:hint="cs"/>
+          <w:sz w:val="28"/>
+          <w:szCs w:val="28"/>
+          <w:cs/>
+          <w:lang w:bidi="hi-IN"/>
+        </w:rPr>
+        <w:t xml:space="preserve"> चार चांद</w:t>
+      </w:r>
+      <w:r>
+        <w:rPr>
+          <w:rFonts w:hint="cs"/>
+          <w:sz w:val="28"/>
+          <w:szCs w:val="28"/>
+          <w:cs/>
+          <w:lang w:bidi="hi-IN"/>
+        </w:rPr>
+        <w:t xml:space="preserve"> और लग जाते</w:t>
+      </w:r>
+      <w:r>
+        <w:rPr>
+          <w:rFonts w:hint="cs"/>
+          <w:sz w:val="28"/>
+          <w:szCs w:val="28"/>
+          <w:cs/>
+          <w:lang w:bidi="hi-IN"/>
+        </w:rPr>
+        <w:t xml:space="preserve"> हैं</w:t>
+      </w:r>
+      <w:r>
+        <w:rPr>
+          <w:rFonts w:hint="cs"/>
+          <w:sz w:val="28"/>
+          <w:szCs w:val="28"/>
+          <w:cs/>
+          <w:lang w:bidi="hi-IN"/>
+        </w:rPr>
+        <w:t>,</w:t>
+      </w:r>
+      <w:r>
+        <w:rPr>
+          <w:rFonts w:hint="cs"/>
+          <w:sz w:val="28"/>
+          <w:szCs w:val="28"/>
+          <w:cs/>
+          <w:lang w:bidi="hi-IN"/>
+        </w:rPr>
+        <w:t xml:space="preserve"> जहां</w:t>
+      </w:r>
+      <w:r>
+        <w:rPr>
+          <w:rFonts w:hint="cs"/>
+          <w:sz w:val="28"/>
+          <w:szCs w:val="28"/>
+          <w:cs/>
+          <w:lang w:bidi="hi-IN"/>
+        </w:rPr>
+        <w:t xml:space="preserve"> प्र</w:t>
+      </w:r>
+      <w:r>
+        <w:rPr>
+          <w:rFonts w:hint="cs"/>
+          <w:sz w:val="28"/>
+          <w:szCs w:val="28"/>
+          <w:cs/>
+          <w:lang w:bidi="hi-IN"/>
+        </w:rPr>
+        <w:t>वे</w:t>
+      </w:r>
+      <w:r>
+        <w:rPr>
+          <w:rFonts w:hint="cs"/>
+          <w:sz w:val="28"/>
+          <w:szCs w:val="28"/>
+          <w:cs/>
+          <w:lang w:bidi="hi-IN"/>
+        </w:rPr>
+        <w:t>श करते ही</w:t>
+      </w:r>
+      <w:r>
+        <w:rPr>
+          <w:rFonts w:hint="cs"/>
+          <w:sz w:val="28"/>
+          <w:szCs w:val="28"/>
+          <w:cs/>
+          <w:lang w:bidi="hi-IN"/>
+        </w:rPr>
+        <w:t xml:space="preserve"> दर्शक</w:t>
+      </w:r>
+      <w:r>
+        <w:rPr>
+          <w:rFonts w:hint="cs"/>
+          <w:sz w:val="28"/>
+          <w:szCs w:val="28"/>
+          <w:cs/>
+          <w:lang w:bidi="hi-IN"/>
+        </w:rPr>
+        <w:t xml:space="preserve"> </w:t>
+      </w:r>
+      <w:r>
+        <w:rPr>
+          <w:rFonts w:hint="cs"/>
+          <w:sz w:val="28"/>
+          <w:szCs w:val="28"/>
+          <w:cs/>
+          <w:lang w:bidi="hi-IN"/>
+        </w:rPr>
+        <w:t>भी</w:t>
+      </w:r>
+      <w:r>
+        <w:rPr>
+          <w:rFonts w:hint="cs"/>
+          <w:sz w:val="28"/>
+          <w:szCs w:val="28"/>
+          <w:cs/>
+          <w:lang w:bidi="hi-IN"/>
+        </w:rPr>
+        <w:t xml:space="preserve"> अपने स्पर्श से</w:t>
+      </w:r>
+      <w:r>
+        <w:rPr>
+          <w:rFonts w:hint="cs"/>
+          <w:sz w:val="28"/>
+          <w:szCs w:val="28"/>
+          <w:cs/>
+          <w:lang w:bidi="hi-IN"/>
+        </w:rPr>
+        <w:t xml:space="preserve"> उन सब </w:t>
+      </w:r>
+      <w:r>
+        <w:rPr>
+          <w:rFonts w:hint="cs"/>
+          <w:sz w:val="28"/>
+          <w:szCs w:val="28"/>
+          <w:cs/>
+          <w:lang w:bidi="hi-IN"/>
+        </w:rPr>
+        <w:t xml:space="preserve">कलात्मक प्रदर्शन का </w:t>
+      </w:r>
+      <w:r>
+        <w:rPr>
+          <w:rFonts w:hint="cs"/>
+          <w:sz w:val="28"/>
+          <w:szCs w:val="28"/>
+          <w:cs/>
+          <w:lang w:bidi="hi-IN"/>
+        </w:rPr>
+        <w:t>हिस्सा बना रह</w:t>
+      </w:r>
       <w:r>
         <w:rPr>
           <w:rFonts w:hint="cs"/>
@@ -2544,124 +2502,6 @@
           <w:cs/>
           <w:lang w:bidi="hi-IN"/>
         </w:rPr>
-        <w:t xml:space="preserve">कनीक और प्रकृति </w:t>
-      </w:r>
-      <w:r>
-        <w:rPr>
-          <w:rFonts w:hint="cs"/>
-          <w:sz w:val="28"/>
-          <w:szCs w:val="28"/>
-          <w:cs/>
-          <w:lang w:bidi="hi-IN"/>
-        </w:rPr>
-        <w:t>का अद्भुत सं</w:t>
-      </w:r>
-      <w:r>
-        <w:rPr>
-          <w:rFonts w:hint="cs"/>
-          <w:sz w:val="28"/>
-          <w:szCs w:val="28"/>
-          <w:cs/>
-          <w:lang w:bidi="hi-IN"/>
-        </w:rPr>
-        <w:t>गम...</w:t>
-      </w:r>
-      <w:r>
-        <w:rPr>
-          <w:rFonts w:hint="cs"/>
-          <w:sz w:val="28"/>
-          <w:szCs w:val="28"/>
-          <w:cs/>
-          <w:lang w:bidi="hi-IN"/>
-        </w:rPr>
-        <w:t>टीम लैब</w:t>
-      </w:r>
-      <w:r>
-        <w:rPr>
-          <w:rFonts w:hint="cs"/>
-          <w:sz w:val="28"/>
-          <w:szCs w:val="28"/>
-          <w:cs/>
-          <w:lang w:bidi="hi-IN"/>
-        </w:rPr>
-        <w:t xml:space="preserve"> </w:t>
-      </w:r>
-      <w:r>
-        <w:rPr>
-          <w:rFonts w:hint="cs"/>
-          <w:sz w:val="28"/>
-          <w:szCs w:val="28"/>
-          <w:cs/>
-          <w:lang w:bidi="hi-IN"/>
-        </w:rPr>
-        <w:t xml:space="preserve">उसका </w:t>
-      </w:r>
-      <w:r>
-        <w:rPr>
-          <w:rFonts w:hint="cs"/>
-          <w:sz w:val="28"/>
-          <w:szCs w:val="28"/>
-          <w:cs/>
-          <w:lang w:bidi="hi-IN"/>
-        </w:rPr>
-        <w:t>उत्कृष्ट</w:t>
-      </w:r>
-      <w:r>
-        <w:rPr>
-          <w:rFonts w:hint="cs"/>
-          <w:sz w:val="28"/>
-          <w:szCs w:val="28"/>
-          <w:cs/>
-          <w:lang w:bidi="hi-IN"/>
-        </w:rPr>
-        <w:t xml:space="preserve"> </w:t>
-      </w:r>
-      <w:r>
-        <w:rPr>
-          <w:rFonts w:hint="cs"/>
-          <w:sz w:val="28"/>
-          <w:szCs w:val="28"/>
-          <w:cs/>
-          <w:lang w:bidi="hi-IN"/>
-        </w:rPr>
-        <w:t xml:space="preserve">उदाहरण </w:t>
-      </w:r>
-      <w:r>
-        <w:rPr>
-          <w:rFonts w:hint="cs"/>
-          <w:sz w:val="28"/>
-          <w:szCs w:val="28"/>
-          <w:cs/>
-          <w:lang w:bidi="hi-IN"/>
-        </w:rPr>
-        <w:t>है</w:t>
-      </w:r>
-      <w:r>
-        <w:rPr>
-          <w:rFonts w:hint="cs"/>
-          <w:sz w:val="28"/>
-          <w:szCs w:val="28"/>
-          <w:lang w:bidi="hi-IN"/>
-        </w:rPr>
-        <w:t>,</w:t>
-      </w:r>
-      <w:r>
-        <w:rPr>
-          <w:rFonts w:hint="cs"/>
-          <w:sz w:val="28"/>
-          <w:szCs w:val="28"/>
-          <w:cs/>
-          <w:lang w:bidi="hi-IN"/>
-        </w:rPr>
-        <w:t xml:space="preserve"> जैस</w:t>
-      </w:r>
-      <w:r>
-        <w:rPr>
-          <w:sz w:val="28"/>
-          <w:szCs w:val="28"/>
-          <w:cs/>
-          <w:lang w:bidi="hi-IN"/>
-        </w:rPr>
         <w:t>े</w:t>
       </w:r>
       <w:r>
@@ -2672,214 +2512,34 @@
           <w:cs/>
           <w:lang w:bidi="hi-IN"/>
         </w:rPr>
-        <w:t xml:space="preserve"> कि</w:t>
-      </w:r>
-      <w:r>
-        <w:rPr>
-          <w:rFonts w:hint="cs"/>
-          <w:sz w:val="28"/>
-          <w:szCs w:val="28"/>
-          <w:cs/>
-          <w:lang w:bidi="hi-IN"/>
-        </w:rPr>
-        <w:t xml:space="preserve"> प्रकृति </w:t>
-      </w:r>
-      <w:r>
-        <w:rPr>
-          <w:rFonts w:hint="cs"/>
-          <w:sz w:val="28"/>
-          <w:szCs w:val="28"/>
-          <w:cs/>
-          <w:lang w:bidi="hi-IN"/>
-        </w:rPr>
-        <w:t xml:space="preserve">को </w:t>
-      </w:r>
-      <w:r>
-        <w:rPr>
-          <w:rFonts w:hint="cs"/>
-          <w:sz w:val="28"/>
-          <w:szCs w:val="28"/>
-          <w:cs/>
-          <w:lang w:bidi="hi-IN"/>
-        </w:rPr>
-        <w:t xml:space="preserve">सीमाएं को </w:t>
-      </w:r>
-      <w:r>
-        <w:rPr>
-          <w:rFonts w:hint="cs"/>
-          <w:sz w:val="28"/>
-          <w:szCs w:val="28"/>
-          <w:cs/>
-          <w:lang w:bidi="hi-IN"/>
-        </w:rPr>
-        <w:t>बाधा नहीं जा सकता है</w:t>
-      </w:r>
-      <w:r>
-        <w:rPr>
-          <w:rFonts w:hint="cs"/>
-          <w:sz w:val="28"/>
-          <w:szCs w:val="28"/>
-          <w:cs/>
-          <w:lang w:bidi="hi-IN"/>
-        </w:rPr>
-        <w:t>,</w:t>
-      </w:r>
-      <w:r>
-        <w:rPr>
-          <w:rFonts w:hint="cs"/>
-          <w:sz w:val="28"/>
-          <w:szCs w:val="28"/>
-          <w:cs/>
-          <w:lang w:bidi="hi-IN"/>
-        </w:rPr>
-        <w:t xml:space="preserve"> </w:t>
-      </w:r>
-      <w:r>
-        <w:rPr>
-          <w:rFonts w:hint="cs"/>
-          <w:sz w:val="28"/>
-          <w:szCs w:val="28"/>
-          <w:cs/>
-          <w:lang w:bidi="hi-IN"/>
-        </w:rPr>
-        <w:t xml:space="preserve">उसी तरह </w:t>
-      </w:r>
-      <w:r>
-        <w:rPr>
-          <w:rFonts w:hint="cs"/>
-          <w:sz w:val="28"/>
-          <w:szCs w:val="28"/>
-          <w:cs/>
-          <w:lang w:bidi="hi-IN"/>
-        </w:rPr>
-        <w:t>कल</w:t>
-      </w:r>
-      <w:r>
-        <w:rPr>
-          <w:rFonts w:hint="cs"/>
-          <w:sz w:val="28"/>
-          <w:szCs w:val="28"/>
-          <w:cs/>
-          <w:lang w:bidi="hi-IN"/>
-        </w:rPr>
-        <w:t xml:space="preserve">ा और कलाकारों </w:t>
-      </w:r>
-      <w:r>
-        <w:rPr>
-          <w:rFonts w:hint="cs"/>
-          <w:sz w:val="28"/>
-          <w:szCs w:val="28"/>
-          <w:cs/>
-          <w:lang w:bidi="hi-IN"/>
-        </w:rPr>
-        <w:t>क</w:t>
-      </w:r>
-      <w:r>
-        <w:rPr>
-          <w:rFonts w:hint="cs"/>
-          <w:sz w:val="28"/>
-          <w:szCs w:val="28"/>
-          <w:cs/>
-          <w:lang w:bidi="hi-IN"/>
-        </w:rPr>
-        <w:t>े मन की</w:t>
-      </w:r>
-      <w:r>
-        <w:rPr>
-          <w:rFonts w:hint="cs"/>
-          <w:sz w:val="28"/>
-          <w:szCs w:val="28"/>
-          <w:cs/>
-          <w:lang w:bidi="hi-IN"/>
-        </w:rPr>
-        <w:t xml:space="preserve"> </w:t>
-      </w:r>
-      <w:r>
-        <w:rPr>
-          <w:rFonts w:hint="cs"/>
-          <w:sz w:val="28"/>
-          <w:szCs w:val="28"/>
-          <w:cs/>
-          <w:lang w:bidi="hi-IN"/>
-        </w:rPr>
-        <w:t>उड़ानों को नापा न</w:t>
-      </w:r>
-      <w:r>
-        <w:rPr>
-          <w:rFonts w:hint="cs"/>
-          <w:sz w:val="28"/>
-          <w:szCs w:val="28"/>
-          <w:cs/>
-          <w:lang w:bidi="hi-IN"/>
-        </w:rPr>
-        <w:t>हीं जा सकता है।</w:t>
-      </w:r>
-      <w:r>
-        <w:rPr>
-          <w:rFonts w:hint="cs"/>
-          <w:sz w:val="28"/>
-          <w:szCs w:val="28"/>
-          <w:cs/>
-          <w:lang w:bidi="hi-IN"/>
-        </w:rPr>
-        <w:t xml:space="preserve"> </w:t>
-      </w:r>
-      <w:r>
-        <w:rPr>
-          <w:rFonts w:hint="cs"/>
-          <w:sz w:val="28"/>
-          <w:szCs w:val="28"/>
-          <w:cs/>
-          <w:lang w:bidi="hi-IN"/>
-        </w:rPr>
-        <w:t>इस</w:t>
-      </w:r>
-      <w:r>
-        <w:rPr>
-          <w:rFonts w:hint="cs"/>
-          <w:sz w:val="28"/>
-          <w:szCs w:val="28"/>
-          <w:cs/>
-          <w:lang w:bidi="hi-IN"/>
-        </w:rPr>
-        <w:t xml:space="preserve"> कला </w:t>
-      </w:r>
-      <w:r>
-        <w:rPr>
-          <w:rFonts w:hint="cs"/>
-          <w:sz w:val="28"/>
-          <w:szCs w:val="28"/>
-          <w:cs/>
-          <w:lang w:bidi="hi-IN"/>
-        </w:rPr>
-        <w:t>प्रदर्शन के पीछे</w:t>
-      </w:r>
-      <w:r>
-        <w:rPr>
-          <w:rFonts w:hint="cs"/>
-          <w:sz w:val="28"/>
-          <w:szCs w:val="28"/>
-          <w:cs/>
-          <w:lang w:bidi="hi-IN"/>
-        </w:rPr>
-        <w:t xml:space="preserve"> </w:t>
-      </w:r>
-      <w:r>
-        <w:rPr>
-          <w:rFonts w:hint="cs"/>
-          <w:sz w:val="28"/>
-          <w:szCs w:val="28"/>
-          <w:cs/>
-          <w:lang w:bidi="hi-IN"/>
-        </w:rPr>
-        <w:t xml:space="preserve">कई </w:t>
-      </w:r>
-      <w:r>
-        <w:rPr>
-          <w:rFonts w:hint="cs"/>
-          <w:sz w:val="28"/>
-          <w:szCs w:val="28"/>
-          <w:cs/>
+        <w:t xml:space="preserve"> है</w:t>
+      </w:r>
+      <w:r>
+        <w:rPr>
+          <w:rFonts w:hint="cs"/>
+          <w:sz w:val="28"/>
+          <w:szCs w:val="28"/>
+          <w:cs/>
+          <w:lang w:bidi="hi-IN"/>
+        </w:rPr>
+        <w:t>ं</w:t>
+      </w:r>
+      <w:r>
+        <w:rPr>
+          <w:rFonts w:hint="cs"/>
+          <w:sz w:val="28"/>
+          <w:szCs w:val="28"/>
+          <w:cs/>
+          <w:lang w:bidi="hi-IN"/>
+        </w:rPr>
+        <w:t>।</w:t>
+      </w:r>
+    </w:p>
+    <w:p>
+      <w:pPr>
+        <w:rPr>
+          <w:sz w:val="28"/>
+          <w:szCs w:val="28"/>
           <w:lang w:bidi="hi-IN"/>
           <w14:reflection w14:blurRad="6350" w14:stA="53000" w14:stPos="0" w14:endA="300" w14:endPos="35500" w14:dist="0" w14:dir="5400000" w14:fadeDir="5400000" w14:sx="100000" w14:sy="-90000" w14:kx="0" w14:ky="0" w14:algn="bl"/>
           <w14:textOutline w14:w="0" w14:cap="flat" w14:cmpd="sng" w14:algn="ctr">
@@ -2909,7 +2569,354 @@
             </w14:gradFill>
           </w14:textFill>
         </w:rPr>
-        <w:t>समूहों</w:t>
+      </w:pPr>
+      <w:r>
+        <w:rPr>
+          <w:rFonts w:hint="cs"/>
+          <w:sz w:val="28"/>
+          <w:szCs w:val="28"/>
+          <w:cs/>
+          <w:lang w:bidi="hi-IN"/>
+        </w:rPr>
+        <w:t>त</w:t>
+      </w:r>
+      <w:r>
+        <w:rPr>
+          <w:rFonts w:hint="cs"/>
+          <w:sz w:val="28"/>
+          <w:szCs w:val="28"/>
+          <w:cs/>
+          <w:lang w:bidi="hi-IN"/>
+        </w:rPr>
+        <w:t xml:space="preserve">कनीक और प्रकृति </w:t>
+      </w:r>
+      <w:r>
+        <w:rPr>
+          <w:rFonts w:hint="cs"/>
+          <w:sz w:val="28"/>
+          <w:szCs w:val="28"/>
+          <w:cs/>
+          <w:lang w:bidi="hi-IN"/>
+        </w:rPr>
+        <w:t>का अद्भुत सं</w:t>
+      </w:r>
+      <w:r>
+        <w:rPr>
+          <w:rFonts w:hint="cs"/>
+          <w:sz w:val="28"/>
+          <w:szCs w:val="28"/>
+          <w:cs/>
+          <w:lang w:bidi="hi-IN"/>
+        </w:rPr>
+        <w:t>गम...</w:t>
+      </w:r>
+      <w:r>
+        <w:rPr>
+          <w:rFonts w:hint="cs"/>
+          <w:sz w:val="28"/>
+          <w:szCs w:val="28"/>
+          <w:cs/>
+          <w:lang w:bidi="hi-IN"/>
+        </w:rPr>
+        <w:t>टीम लैब</w:t>
+      </w:r>
+      <w:r>
+        <w:rPr>
+          <w:rFonts w:hint="cs"/>
+          <w:sz w:val="28"/>
+          <w:szCs w:val="28"/>
+          <w:cs/>
+          <w:lang w:bidi="hi-IN"/>
+        </w:rPr>
+        <w:t xml:space="preserve"> </w:t>
+      </w:r>
+      <w:r>
+        <w:rPr>
+          <w:rFonts w:hint="cs"/>
+          <w:sz w:val="28"/>
+          <w:szCs w:val="28"/>
+          <w:cs/>
+          <w:lang w:bidi="hi-IN"/>
+        </w:rPr>
+        <w:t xml:space="preserve">उसका </w:t>
+      </w:r>
+      <w:r>
+        <w:rPr>
+          <w:rFonts w:hint="cs"/>
+          <w:sz w:val="28"/>
+          <w:szCs w:val="28"/>
+          <w:cs/>
+          <w:lang w:bidi="hi-IN"/>
+        </w:rPr>
+        <w:t>उत्कृष्ट</w:t>
+      </w:r>
+      <w:r>
+        <w:rPr>
+          <w:rFonts w:hint="cs"/>
+          <w:sz w:val="28"/>
+          <w:szCs w:val="28"/>
+          <w:cs/>
+          <w:lang w:bidi="hi-IN"/>
+        </w:rPr>
+        <w:t xml:space="preserve"> </w:t>
+      </w:r>
+      <w:r>
+        <w:rPr>
+          <w:rFonts w:hint="cs"/>
+          <w:sz w:val="28"/>
+          <w:szCs w:val="28"/>
+          <w:cs/>
+          <w:lang w:bidi="hi-IN"/>
+        </w:rPr>
+        <w:t xml:space="preserve">उदाहरण </w:t>
+      </w:r>
+      <w:r>
+        <w:rPr>
+          <w:rFonts w:hint="cs"/>
+          <w:sz w:val="28"/>
+          <w:szCs w:val="28"/>
+          <w:cs/>
+          <w:lang w:bidi="hi-IN"/>
+        </w:rPr>
+        <w:t>है</w:t>
+      </w:r>
+      <w:r>
+        <w:rPr>
+          <w:rFonts w:hint="cs"/>
+          <w:sz w:val="28"/>
+          <w:szCs w:val="28"/>
+          <w:lang w:bidi="hi-IN"/>
+        </w:rPr>
+        <w:t>,</w:t>
+      </w:r>
+      <w:r>
+        <w:rPr>
+          <w:rFonts w:hint="cs"/>
+          <w:sz w:val="28"/>
+          <w:szCs w:val="28"/>
+          <w:cs/>
+          <w:lang w:bidi="hi-IN"/>
+        </w:rPr>
+        <w:t xml:space="preserve"> जैस</w:t>
+      </w:r>
+      <w:r>
+        <w:rPr>
+          <w:sz w:val="28"/>
+          <w:szCs w:val="28"/>
+          <w:cs/>
+          <w:lang w:bidi="hi-IN"/>
+        </w:rPr>
+        <w:t>े</w:t>
+      </w:r>
+      <w:r>
+        <w:rPr>
+          <w:rFonts w:hint="cs"/>
+          <w:sz w:val="28"/>
+          <w:szCs w:val="28"/>
+          <w:cs/>
+          <w:lang w:bidi="hi-IN"/>
+        </w:rPr>
+        <w:t xml:space="preserve"> कि</w:t>
+      </w:r>
+      <w:r>
+        <w:rPr>
+          <w:rFonts w:hint="cs"/>
+          <w:sz w:val="28"/>
+          <w:szCs w:val="28"/>
+          <w:cs/>
+          <w:lang w:bidi="hi-IN"/>
+        </w:rPr>
+        <w:t xml:space="preserve"> प्रकृति </w:t>
+      </w:r>
+      <w:r>
+        <w:rPr>
+          <w:rFonts w:hint="cs"/>
+          <w:sz w:val="28"/>
+          <w:szCs w:val="28"/>
+          <w:cs/>
+          <w:lang w:bidi="hi-IN"/>
+        </w:rPr>
+        <w:t xml:space="preserve">को </w:t>
+      </w:r>
+      <w:r>
+        <w:rPr>
+          <w:rFonts w:hint="cs"/>
+          <w:sz w:val="28"/>
+          <w:szCs w:val="28"/>
+          <w:cs/>
+          <w:lang w:bidi="hi-IN"/>
+        </w:rPr>
+        <w:t xml:space="preserve">सीमाएं को </w:t>
+      </w:r>
+      <w:r>
+        <w:rPr>
+          <w:rFonts w:hint="cs"/>
+          <w:sz w:val="28"/>
+          <w:szCs w:val="28"/>
+          <w:cs/>
+          <w:lang w:bidi="hi-IN"/>
+        </w:rPr>
+        <w:t>बाधा नहीं जा सकता है</w:t>
+      </w:r>
+      <w:r>
+        <w:rPr>
+          <w:rFonts w:hint="cs"/>
+          <w:sz w:val="28"/>
+          <w:szCs w:val="28"/>
+          <w:cs/>
+          <w:lang w:bidi="hi-IN"/>
+        </w:rPr>
+        <w:t>,</w:t>
+      </w:r>
+      <w:r>
+        <w:rPr>
+          <w:rFonts w:hint="cs"/>
+          <w:sz w:val="28"/>
+          <w:szCs w:val="28"/>
+          <w:cs/>
+          <w:lang w:bidi="hi-IN"/>
+        </w:rPr>
+        <w:t xml:space="preserve"> </w:t>
+      </w:r>
+      <w:r>
+        <w:rPr>
+          <w:rFonts w:hint="cs"/>
+          <w:sz w:val="28"/>
+          <w:szCs w:val="28"/>
+          <w:cs/>
+          <w:lang w:bidi="hi-IN"/>
+        </w:rPr>
+        <w:t xml:space="preserve">उसी तरह </w:t>
+      </w:r>
+      <w:r>
+        <w:rPr>
+          <w:rFonts w:hint="cs"/>
+          <w:sz w:val="28"/>
+          <w:szCs w:val="28"/>
+          <w:cs/>
+          <w:lang w:bidi="hi-IN"/>
+        </w:rPr>
+        <w:t>कल</w:t>
+      </w:r>
+      <w:r>
+        <w:rPr>
+          <w:rFonts w:hint="cs"/>
+          <w:sz w:val="28"/>
+          <w:szCs w:val="28"/>
+          <w:cs/>
+          <w:lang w:bidi="hi-IN"/>
+        </w:rPr>
+        <w:t xml:space="preserve">ा और कलाकारों </w:t>
+      </w:r>
+      <w:r>
+        <w:rPr>
+          <w:rFonts w:hint="cs"/>
+          <w:sz w:val="28"/>
+          <w:szCs w:val="28"/>
+          <w:cs/>
+          <w:lang w:bidi="hi-IN"/>
+        </w:rPr>
+        <w:t>क</w:t>
+      </w:r>
+      <w:r>
+        <w:rPr>
+          <w:rFonts w:hint="cs"/>
+          <w:sz w:val="28"/>
+          <w:szCs w:val="28"/>
+          <w:cs/>
+          <w:lang w:bidi="hi-IN"/>
+        </w:rPr>
+        <w:t>े मन की</w:t>
+      </w:r>
+      <w:r>
+        <w:rPr>
+          <w:rFonts w:hint="cs"/>
+          <w:sz w:val="28"/>
+          <w:szCs w:val="28"/>
+          <w:cs/>
+          <w:lang w:bidi="hi-IN"/>
+        </w:rPr>
+        <w:t xml:space="preserve"> </w:t>
+      </w:r>
+      <w:r>
+        <w:rPr>
+          <w:rFonts w:hint="cs"/>
+          <w:sz w:val="28"/>
+          <w:szCs w:val="28"/>
+          <w:cs/>
+          <w:lang w:bidi="hi-IN"/>
+        </w:rPr>
+        <w:t>उड़ानों को नापा न</w:t>
+      </w:r>
+      <w:r>
+        <w:rPr>
+          <w:rFonts w:hint="cs"/>
+          <w:sz w:val="28"/>
+          <w:szCs w:val="28"/>
+          <w:cs/>
+          <w:lang w:bidi="hi-IN"/>
+        </w:rPr>
+        <w:t>हीं जा सकता है।</w:t>
+      </w:r>
+      <w:r>
+        <w:rPr>
+          <w:rFonts w:hint="cs"/>
+          <w:sz w:val="28"/>
+          <w:szCs w:val="28"/>
+          <w:cs/>
+          <w:lang w:bidi="hi-IN"/>
+        </w:rPr>
+        <w:t xml:space="preserve"> </w:t>
+      </w:r>
+      <w:r>
+        <w:rPr>
+          <w:rFonts w:hint="cs"/>
+          <w:sz w:val="28"/>
+          <w:szCs w:val="28"/>
+          <w:cs/>
+          <w:lang w:bidi="hi-IN"/>
+        </w:rPr>
+        <w:t>इस</w:t>
+      </w:r>
+      <w:r>
+        <w:rPr>
+          <w:rFonts w:hint="cs"/>
+          <w:sz w:val="28"/>
+          <w:szCs w:val="28"/>
+          <w:cs/>
+          <w:lang w:bidi="hi-IN"/>
+        </w:rPr>
+        <w:t xml:space="preserve"> कला </w:t>
+      </w:r>
+      <w:r>
+        <w:rPr>
+          <w:rFonts w:hint="cs"/>
+          <w:sz w:val="28"/>
+          <w:szCs w:val="28"/>
+          <w:cs/>
+          <w:lang w:bidi="hi-IN"/>
+        </w:rPr>
+        <w:t>प्रदर्शन के पीछे</w:t>
+      </w:r>
+      <w:r>
+        <w:rPr>
+          <w:rFonts w:hint="cs"/>
+          <w:sz w:val="28"/>
+          <w:szCs w:val="28"/>
+          <w:cs/>
+          <w:lang w:bidi="hi-IN"/>
+        </w:rPr>
+        <w:t xml:space="preserve"> </w:t>
+      </w:r>
+      <w:r>
+        <w:rPr>
+          <w:rFonts w:hint="cs"/>
+          <w:sz w:val="28"/>
+          <w:szCs w:val="28"/>
+          <w:cs/>
+          <w:lang w:bidi="hi-IN"/>
+        </w:rPr>
+        <w:t xml:space="preserve">कई </w:t>
       </w:r>
       <w:r>
         <w:rPr>
@@ -2946,17 +2953,7 @@
             </w14:gradFill>
           </w14:textFill>
         </w:rPr>
-        <w:t xml:space="preserve"> के</w:t>
-      </w:r>
-      <w:r>
-        <w:rPr>
-          <w:rFonts w:hint="cs"/>
-          <w:sz w:val="28"/>
-          <w:szCs w:val="28"/>
-          <w:cs/>
-          <w:lang w:bidi="hi-IN"/>
-        </w:rPr>
-        <w:t xml:space="preserve"> </w:t>
+        <w:t>समूहों</w:t>
       </w:r>
       <w:r>
         <w:rPr>
@@ -2993,7 +2990,17 @@
             </w14:gradFill>
           </w14:textFill>
         </w:rPr>
-        <w:t>सदस्यों</w:t>
+        <w:t xml:space="preserve"> के</w:t>
+      </w:r>
+      <w:r>
+        <w:rPr>
+          <w:rFonts w:hint="cs"/>
+          <w:sz w:val="28"/>
+          <w:szCs w:val="28"/>
+          <w:cs/>
+          <w:lang w:bidi="hi-IN"/>
+        </w:rPr>
+        <w:t xml:space="preserve"> </w:t>
       </w:r>
       <w:r>
         <w:rPr>
@@ -3030,7 +3037,7 @@
             </w14:gradFill>
           </w14:textFill>
         </w:rPr>
-        <w:t xml:space="preserve"> की मेहनत</w:t>
+        <w:t>सदस्यों</w:t>
       </w:r>
       <w:r>
         <w:rPr>
@@ -3067,7 +3074,7 @@
             </w14:gradFill>
           </w14:textFill>
         </w:rPr>
-        <w:t xml:space="preserve"> व ल</w:t>
+        <w:t xml:space="preserve"> की मेहनत</w:t>
       </w:r>
       <w:r>
         <w:rPr>
@@ -3104,7 +3111,7 @@
             </w14:gradFill>
           </w14:textFill>
         </w:rPr>
-        <w:t xml:space="preserve">गन </w:t>
+        <w:t xml:space="preserve"> व ल</w:t>
       </w:r>
       <w:r>
         <w:rPr>
@@ -3141,7 +3148,7 @@
             </w14:gradFill>
           </w14:textFill>
         </w:rPr>
-        <w:t xml:space="preserve">ने </w:t>
+        <w:t xml:space="preserve">गन </w:t>
       </w:r>
       <w:r>
         <w:rPr>
@@ -3178,7 +3185,7 @@
             </w14:gradFill>
           </w14:textFill>
         </w:rPr>
-        <w:t xml:space="preserve">ही </w:t>
+        <w:t xml:space="preserve">ने </w:t>
       </w:r>
       <w:r>
         <w:rPr>
@@ -3215,7 +3222,7 @@
             </w14:gradFill>
           </w14:textFill>
         </w:rPr>
-        <w:t>पर्यटकों के</w:t>
+        <w:t xml:space="preserve">ही </w:t>
       </w:r>
       <w:r>
         <w:rPr>
@@ -3252,7 +3259,7 @@
             </w14:gradFill>
           </w14:textFill>
         </w:rPr>
-        <w:t xml:space="preserve"> </w:t>
+        <w:t>पर्यटकों के</w:t>
       </w:r>
       <w:r>
         <w:rPr>
@@ -3289,7 +3296,7 @@
             </w14:gradFill>
           </w14:textFill>
         </w:rPr>
-        <w:t>लिए</w:t>
+        <w:t xml:space="preserve"> </w:t>
       </w:r>
       <w:r>
         <w:rPr>
@@ -3326,7 +3333,7 @@
             </w14:gradFill>
           </w14:textFill>
         </w:rPr>
-        <w:t xml:space="preserve"> </w:t>
+        <w:t>लिए</w:t>
       </w:r>
       <w:r>
         <w:rPr>
@@ -3363,7 +3370,7 @@
             </w14:gradFill>
           </w14:textFill>
         </w:rPr>
-        <w:t>यह</w:t>
+        <w:t xml:space="preserve"> </w:t>
       </w:r>
       <w:r>
         <w:rPr>
@@ -3400,7 +3407,7 @@
             </w14:gradFill>
           </w14:textFill>
         </w:rPr>
-        <w:t>ां</w:t>
+        <w:t>यह</w:t>
       </w:r>
       <w:r>
         <w:rPr>
@@ -3437,7 +3444,7 @@
             </w14:gradFill>
           </w14:textFill>
         </w:rPr>
-        <w:t xml:space="preserve"> एक </w:t>
+        <w:t>ां</w:t>
       </w:r>
       <w:r>
         <w:rPr>
@@ -3474,7 +3481,7 @@
             </w14:gradFill>
           </w14:textFill>
         </w:rPr>
-        <w:t>अविश्वसनीय</w:t>
+        <w:t xml:space="preserve"> एक </w:t>
       </w:r>
       <w:r>
         <w:rPr>
@@ -3511,7 +3518,7 @@
             </w14:gradFill>
           </w14:textFill>
         </w:rPr>
-        <w:t xml:space="preserve"> </w:t>
+        <w:t>अविश्वसनीय</w:t>
       </w:r>
       <w:r>
         <w:rPr>
@@ -3548,7 +3555,7 @@
             </w14:gradFill>
           </w14:textFill>
         </w:rPr>
-        <w:t xml:space="preserve">डिजिटल </w:t>
+        <w:t xml:space="preserve"> </w:t>
       </w:r>
       <w:r>
         <w:rPr>
@@ -3585,7 +3592,7 @@
             </w14:gradFill>
           </w14:textFill>
         </w:rPr>
-        <w:t xml:space="preserve">आर्ट </w:t>
+        <w:t xml:space="preserve">डिजिटल </w:t>
       </w:r>
       <w:r>
         <w:rPr>
@@ -3622,8 +3629,9 @@
             </w14:gradFill>
           </w14:textFill>
         </w:rPr>
-        <w:t>स्पेस</w:t>
-      </w:r>
+        <w:t xml:space="preserve">आर्ट </w:t>
+      </w:r>
+      <w:proofErr w:type="spellStart"/>
       <w:r>
         <w:rPr>
           <w:rFonts w:hint="cs"/>
@@ -3659,8 +3667,9 @@
             </w14:gradFill>
           </w14:textFill>
         </w:rPr>
-        <w:t xml:space="preserve"> </w:t>
-      </w:r>
+        <w:t>स्पेस</w:t>
+      </w:r>
+      <w:proofErr w:type="spellEnd"/>
       <w:r>
         <w:rPr>
           <w:rFonts w:hint="cs"/>
@@ -3696,7 +3705,7 @@
             </w14:gradFill>
           </w14:textFill>
         </w:rPr>
-        <w:t>प्रदर्शनी स्थल की स्थापना की है।</w:t>
+        <w:t xml:space="preserve"> </w:t>
       </w:r>
       <w:r>
         <w:rPr>
@@ -3733,616 +3742,8 @@
             </w14:gradFill>
           </w14:textFill>
         </w:rPr>
-        <w:t xml:space="preserve"> </w:t>
-      </w:r>
-    </w:p>
-    <w:p>
-      <w:pPr>
-        <w:rPr>
-          <w:sz w:val="28"/>
-          <w:szCs w:val="28"/>
-          <w:lang w:bidi="hi-IN"/>
-        </w:rPr>
-      </w:pPr>
-      <w:r>
-        <w:rPr>
-          <w:rFonts w:hint="cs"/>
-          <w:sz w:val="28"/>
-          <w:szCs w:val="28"/>
-          <w:cs/>
-          <w:lang w:bidi="hi-IN"/>
-        </w:rPr>
-        <w:t>‘</w:t>
-      </w:r>
-      <w:r>
-        <w:rPr>
-          <w:rFonts w:hint="cs"/>
-          <w:sz w:val="28"/>
-          <w:szCs w:val="28"/>
-          <w:cs/>
-          <w:lang w:bidi="hi-IN"/>
-        </w:rPr>
-        <w:t>टीम लैब</w:t>
-      </w:r>
-      <w:r>
-        <w:rPr>
-          <w:rFonts w:hint="cs"/>
-          <w:sz w:val="28"/>
-          <w:szCs w:val="28"/>
-          <w:cs/>
-          <w:lang w:bidi="hi-IN"/>
-        </w:rPr>
-        <w:t>’</w:t>
-      </w:r>
-      <w:r>
-        <w:rPr>
-          <w:rFonts w:hint="cs"/>
-          <w:sz w:val="28"/>
-          <w:szCs w:val="28"/>
-          <w:cs/>
-          <w:lang w:bidi="hi-IN"/>
-        </w:rPr>
-        <w:t xml:space="preserve"> </w:t>
-      </w:r>
-      <w:r>
-        <w:rPr>
-          <w:rFonts w:hint="cs"/>
-          <w:sz w:val="28"/>
-          <w:szCs w:val="28"/>
-          <w:cs/>
-          <w:lang w:bidi="hi-IN"/>
-        </w:rPr>
-        <w:t>की इस</w:t>
-      </w:r>
-      <w:r>
-        <w:rPr>
-          <w:rFonts w:hint="cs"/>
-          <w:sz w:val="28"/>
-          <w:szCs w:val="28"/>
-          <w:cs/>
-          <w:lang w:bidi="hi-IN"/>
-        </w:rPr>
-        <w:t xml:space="preserve"> जादुई</w:t>
-      </w:r>
-      <w:r>
-        <w:rPr>
-          <w:rFonts w:hint="cs"/>
-          <w:sz w:val="28"/>
-          <w:szCs w:val="28"/>
-          <w:cs/>
-          <w:lang w:bidi="hi-IN"/>
-        </w:rPr>
-        <w:t xml:space="preserve"> दुनिया</w:t>
-      </w:r>
-      <w:r>
-        <w:rPr>
-          <w:rFonts w:hint="cs"/>
-          <w:sz w:val="28"/>
-          <w:szCs w:val="28"/>
-          <w:cs/>
-          <w:lang w:bidi="hi-IN"/>
-        </w:rPr>
-        <w:t xml:space="preserve"> </w:t>
-      </w:r>
-      <w:r>
-        <w:rPr>
-          <w:rFonts w:hint="cs"/>
-          <w:sz w:val="28"/>
-          <w:szCs w:val="28"/>
-          <w:cs/>
-          <w:lang w:bidi="hi-IN"/>
-        </w:rPr>
-        <w:t xml:space="preserve">की सैर </w:t>
-      </w:r>
-      <w:r>
-        <w:rPr>
-          <w:rFonts w:hint="cs"/>
-          <w:sz w:val="28"/>
-          <w:szCs w:val="28"/>
-          <w:cs/>
-          <w:lang w:bidi="hi-IN"/>
-        </w:rPr>
-        <w:t>को हलके में न ले..</w:t>
-      </w:r>
-      <w:r>
-        <w:rPr>
-          <w:rFonts w:hint="cs"/>
-          <w:sz w:val="28"/>
-          <w:szCs w:val="28"/>
-          <w:cs/>
-          <w:lang w:bidi="hi-IN"/>
-        </w:rPr>
-        <w:t xml:space="preserve"> इसकी</w:t>
-      </w:r>
-      <w:r>
-        <w:rPr>
-          <w:rFonts w:hint="cs"/>
-          <w:sz w:val="28"/>
-          <w:szCs w:val="28"/>
-          <w:cs/>
-          <w:lang w:bidi="hi-IN"/>
-        </w:rPr>
-        <w:t xml:space="preserve"> </w:t>
-      </w:r>
-      <w:r>
-        <w:rPr>
-          <w:rFonts w:hint="cs"/>
-          <w:sz w:val="28"/>
-          <w:szCs w:val="28"/>
-          <w:cs/>
-          <w:lang w:bidi="hi-IN"/>
-        </w:rPr>
-        <w:t>इंटर</w:t>
-      </w:r>
-      <w:r>
-        <w:rPr>
-          <w:rFonts w:hint="cs"/>
-          <w:sz w:val="28"/>
-          <w:szCs w:val="28"/>
-          <w:cs/>
-          <w:lang w:bidi="hi-IN"/>
-        </w:rPr>
-        <w:t>एक्टिविटी</w:t>
-      </w:r>
-      <w:r>
-        <w:rPr>
-          <w:rFonts w:hint="cs"/>
-          <w:sz w:val="28"/>
-          <w:szCs w:val="28"/>
-          <w:cs/>
-          <w:lang w:bidi="hi-IN"/>
-        </w:rPr>
-        <w:t>:</w:t>
-      </w:r>
-      <w:r>
-        <w:rPr>
-          <w:rFonts w:hint="cs"/>
-          <w:sz w:val="28"/>
-          <w:szCs w:val="28"/>
-          <w:cs/>
-          <w:lang w:bidi="hi-IN"/>
-        </w:rPr>
-        <w:t xml:space="preserve"> </w:t>
-      </w:r>
-      <w:r>
-        <w:rPr>
-          <w:rFonts w:hint="cs"/>
-          <w:sz w:val="28"/>
-          <w:szCs w:val="28"/>
-          <w:cs/>
-          <w:lang w:bidi="hi-IN"/>
-        </w:rPr>
-        <w:t>(</w:t>
-      </w:r>
-      <w:r>
-        <w:rPr>
-          <w:rFonts w:hint="cs"/>
-          <w:sz w:val="28"/>
-          <w:szCs w:val="28"/>
-          <w:cs/>
-          <w:lang w:bidi="hi-IN"/>
-        </w:rPr>
-        <w:t xml:space="preserve">तकनीकी से लेस कला </w:t>
-      </w:r>
-      <w:r>
-        <w:rPr>
-          <w:rFonts w:hint="cs"/>
-          <w:sz w:val="28"/>
-          <w:szCs w:val="28"/>
-          <w:cs/>
-          <w:lang w:bidi="hi-IN"/>
-        </w:rPr>
-        <w:t>का</w:t>
-      </w:r>
-      <w:r>
-        <w:rPr>
-          <w:rFonts w:hint="cs"/>
-          <w:sz w:val="28"/>
-          <w:szCs w:val="28"/>
-          <w:cs/>
-          <w:lang w:bidi="hi-IN"/>
-        </w:rPr>
-        <w:t xml:space="preserve"> </w:t>
-      </w:r>
-      <w:r>
-        <w:rPr>
-          <w:rFonts w:hint="cs"/>
-          <w:sz w:val="28"/>
-          <w:szCs w:val="28"/>
-          <w:cs/>
-          <w:lang w:bidi="hi-IN"/>
-        </w:rPr>
-        <w:t>परस्पर प्रभाव</w:t>
-      </w:r>
-      <w:r>
-        <w:rPr>
-          <w:rFonts w:hint="cs"/>
-          <w:sz w:val="28"/>
-          <w:szCs w:val="28"/>
-          <w:cs/>
-          <w:lang w:bidi="hi-IN"/>
-        </w:rPr>
-        <w:t xml:space="preserve">) इसे अन्य कला </w:t>
-      </w:r>
-      <w:r>
-        <w:rPr>
-          <w:rFonts w:hint="cs"/>
-          <w:sz w:val="28"/>
-          <w:szCs w:val="28"/>
-          <w:cs/>
-          <w:lang w:bidi="hi-IN"/>
-        </w:rPr>
-        <w:t xml:space="preserve">प्रदर्शनियों से हटकर </w:t>
-      </w:r>
-      <w:r>
-        <w:rPr>
-          <w:rFonts w:hint="cs"/>
-          <w:sz w:val="28"/>
-          <w:szCs w:val="28"/>
-          <w:cs/>
-          <w:lang w:bidi="hi-IN"/>
-        </w:rPr>
-        <w:t xml:space="preserve">एक अलग </w:t>
-      </w:r>
-      <w:r>
-        <w:rPr>
-          <w:rFonts w:hint="cs"/>
-          <w:sz w:val="28"/>
-          <w:szCs w:val="28"/>
-          <w:cs/>
-          <w:lang w:bidi="hi-IN"/>
-        </w:rPr>
-        <w:t>विचार</w:t>
-      </w:r>
-      <w:r>
-        <w:rPr>
-          <w:rFonts w:hint="cs"/>
-          <w:sz w:val="28"/>
-          <w:szCs w:val="28"/>
-          <w:cs/>
-          <w:lang w:bidi="hi-IN"/>
-        </w:rPr>
-        <w:t>-</w:t>
-      </w:r>
-      <w:r>
-        <w:rPr>
-          <w:rFonts w:hint="cs"/>
-          <w:sz w:val="28"/>
-          <w:szCs w:val="28"/>
-          <w:cs/>
-          <w:lang w:bidi="hi-IN"/>
-        </w:rPr>
-        <w:t xml:space="preserve">रूप </w:t>
-      </w:r>
-      <w:r>
-        <w:rPr>
-          <w:rFonts w:hint="cs"/>
-          <w:sz w:val="28"/>
-          <w:szCs w:val="28"/>
-          <w:cs/>
-          <w:lang w:bidi="hi-IN"/>
-        </w:rPr>
-        <w:t xml:space="preserve">पर </w:t>
-      </w:r>
-      <w:r>
-        <w:rPr>
-          <w:rFonts w:hint="cs"/>
-          <w:sz w:val="28"/>
-          <w:szCs w:val="28"/>
-          <w:cs/>
-          <w:lang w:bidi="hi-IN"/>
-        </w:rPr>
-        <w:t>बनाया गया है</w:t>
-      </w:r>
-      <w:r>
-        <w:rPr>
-          <w:rFonts w:hint="cs"/>
-          <w:sz w:val="28"/>
-          <w:szCs w:val="28"/>
-          <w:cs/>
-          <w:lang w:bidi="hi-IN"/>
-        </w:rPr>
-        <w:t>।</w:t>
-      </w:r>
-      <w:r>
-        <w:rPr>
-          <w:rFonts w:hint="cs"/>
-          <w:sz w:val="28"/>
-          <w:szCs w:val="28"/>
-          <w:cs/>
-          <w:lang w:bidi="hi-IN"/>
-        </w:rPr>
-        <w:t xml:space="preserve"> हर उम्र के </w:t>
-      </w:r>
-      <w:r>
-        <w:rPr>
-          <w:rFonts w:hint="cs"/>
-          <w:sz w:val="28"/>
-          <w:szCs w:val="28"/>
-          <w:cs/>
-          <w:lang w:bidi="hi-IN"/>
-        </w:rPr>
-        <w:t xml:space="preserve">दर्शकों  </w:t>
-      </w:r>
-      <w:r>
-        <w:rPr>
-          <w:rFonts w:hint="cs"/>
-          <w:sz w:val="28"/>
-          <w:szCs w:val="28"/>
-          <w:cs/>
-          <w:lang w:bidi="hi-IN"/>
-        </w:rPr>
-        <w:t xml:space="preserve">को </w:t>
-      </w:r>
-      <w:r>
-        <w:rPr>
-          <w:rFonts w:hint="cs"/>
-          <w:sz w:val="28"/>
-          <w:szCs w:val="28"/>
-          <w:cs/>
-          <w:lang w:bidi="hi-IN"/>
-        </w:rPr>
-        <w:t>डिजिटल</w:t>
-      </w:r>
-      <w:r>
-        <w:rPr>
-          <w:rFonts w:hint="cs"/>
-          <w:sz w:val="28"/>
-          <w:szCs w:val="28"/>
-          <w:cs/>
-          <w:lang w:bidi="hi-IN"/>
-        </w:rPr>
-        <w:t xml:space="preserve"> </w:t>
-      </w:r>
-      <w:r>
-        <w:rPr>
-          <w:rFonts w:hint="cs"/>
-          <w:sz w:val="28"/>
-          <w:szCs w:val="28"/>
-          <w:cs/>
-          <w:lang w:bidi="hi-IN"/>
-        </w:rPr>
-        <w:t>प्रोग्रामिंग</w:t>
-      </w:r>
-      <w:r>
-        <w:rPr>
-          <w:rFonts w:hint="cs"/>
-          <w:sz w:val="28"/>
-          <w:szCs w:val="28"/>
-          <w:cs/>
-          <w:lang w:bidi="hi-IN"/>
-        </w:rPr>
-        <w:t xml:space="preserve"> </w:t>
-      </w:r>
-      <w:r>
-        <w:rPr>
-          <w:rFonts w:hint="cs"/>
-          <w:sz w:val="28"/>
-          <w:szCs w:val="28"/>
-          <w:cs/>
-          <w:lang w:bidi="hi-IN"/>
-        </w:rPr>
-        <w:t>से</w:t>
-      </w:r>
-      <w:r>
-        <w:rPr>
-          <w:rFonts w:hint="cs"/>
-          <w:sz w:val="28"/>
-          <w:szCs w:val="28"/>
-          <w:cs/>
-          <w:lang w:bidi="hi-IN"/>
-        </w:rPr>
-        <w:t xml:space="preserve"> </w:t>
-      </w:r>
-      <w:r>
-        <w:rPr>
-          <w:rFonts w:hint="cs"/>
-          <w:sz w:val="28"/>
-          <w:szCs w:val="28"/>
-          <w:cs/>
-          <w:lang w:bidi="hi-IN"/>
-        </w:rPr>
-        <w:t>गुरुत्वाकर्षण</w:t>
-      </w:r>
-      <w:r>
-        <w:rPr>
-          <w:rFonts w:hint="cs"/>
-          <w:sz w:val="28"/>
-          <w:szCs w:val="28"/>
-          <w:cs/>
-          <w:lang w:bidi="hi-IN"/>
-        </w:rPr>
-        <w:t xml:space="preserve"> </w:t>
-      </w:r>
-      <w:r>
-        <w:rPr>
-          <w:rFonts w:hint="cs"/>
-          <w:sz w:val="28"/>
-          <w:szCs w:val="28"/>
-          <w:cs/>
-          <w:lang w:bidi="hi-IN"/>
-        </w:rPr>
-        <w:t>(</w:t>
-      </w:r>
-      <w:r>
-        <w:rPr>
-          <w:rFonts w:hint="cs"/>
-          <w:sz w:val="28"/>
-          <w:szCs w:val="28"/>
-          <w:cs/>
-          <w:lang w:bidi="hi-IN"/>
-        </w:rPr>
-        <w:t>ग</w:t>
-      </w:r>
-      <w:r>
-        <w:rPr>
-          <w:rFonts w:hint="cs"/>
-          <w:sz w:val="28"/>
-          <w:szCs w:val="28"/>
-          <w:cs/>
-          <w:lang w:bidi="hi-IN"/>
-        </w:rPr>
-        <w:t>्रे</w:t>
-      </w:r>
-      <w:r>
-        <w:rPr>
-          <w:rFonts w:hint="cs"/>
-          <w:sz w:val="28"/>
-          <w:szCs w:val="28"/>
-          <w:cs/>
-          <w:lang w:bidi="hi-IN"/>
-        </w:rPr>
-        <w:t>विटी</w:t>
-      </w:r>
-      <w:r>
-        <w:rPr>
-          <w:rFonts w:hint="cs"/>
-          <w:sz w:val="28"/>
-          <w:szCs w:val="28"/>
-          <w:cs/>
-          <w:lang w:bidi="hi-IN"/>
-        </w:rPr>
-        <w:t>)</w:t>
-      </w:r>
-      <w:r>
-        <w:rPr>
-          <w:rFonts w:hint="cs"/>
-          <w:sz w:val="28"/>
-          <w:szCs w:val="28"/>
-          <w:cs/>
-          <w:lang w:bidi="hi-IN"/>
-        </w:rPr>
-        <w:t xml:space="preserve"> में तैरती </w:t>
-      </w:r>
-      <w:r>
-        <w:rPr>
-          <w:rFonts w:hint="cs"/>
-          <w:sz w:val="28"/>
-          <w:szCs w:val="28"/>
-          <w:cs/>
-          <w:lang w:bidi="hi-IN"/>
-        </w:rPr>
-        <w:t>कलाकृतियों</w:t>
-      </w:r>
-      <w:r>
-        <w:rPr>
-          <w:rFonts w:hint="cs"/>
-          <w:sz w:val="28"/>
-          <w:szCs w:val="28"/>
-          <w:cs/>
-          <w:lang w:bidi="hi-IN"/>
-        </w:rPr>
-        <w:t xml:space="preserve"> क</w:t>
-      </w:r>
-      <w:r>
-        <w:rPr>
-          <w:rFonts w:hint="cs"/>
-          <w:sz w:val="28"/>
-          <w:szCs w:val="28"/>
-          <w:cs/>
-          <w:lang w:bidi="hi-IN"/>
-        </w:rPr>
-        <w:t>े</w:t>
-      </w:r>
-      <w:r>
-        <w:rPr>
-          <w:rFonts w:hint="cs"/>
-          <w:sz w:val="28"/>
-          <w:szCs w:val="28"/>
-          <w:cs/>
-          <w:lang w:bidi="hi-IN"/>
-        </w:rPr>
-        <w:t xml:space="preserve"> प्रदर्शन</w:t>
-      </w:r>
-      <w:r>
-        <w:rPr>
-          <w:rFonts w:hint="cs"/>
-          <w:sz w:val="28"/>
-          <w:szCs w:val="28"/>
-          <w:cs/>
-          <w:lang w:bidi="hi-IN"/>
-        </w:rPr>
-        <w:t xml:space="preserve"> </w:t>
-      </w:r>
-      <w:r>
-        <w:rPr>
-          <w:rFonts w:hint="cs"/>
-          <w:sz w:val="28"/>
-          <w:szCs w:val="28"/>
-          <w:cs/>
-          <w:lang w:bidi="hi-IN"/>
-        </w:rPr>
-        <w:t>में शामिल</w:t>
-      </w:r>
-      <w:r>
-        <w:rPr>
-          <w:rFonts w:hint="cs"/>
-          <w:sz w:val="28"/>
-          <w:szCs w:val="28"/>
-          <w:cs/>
-          <w:lang w:bidi="hi-IN"/>
-        </w:rPr>
-        <w:t xml:space="preserve"> होने का</w:t>
-      </w:r>
-      <w:r>
-        <w:rPr>
-          <w:rFonts w:hint="cs"/>
-          <w:sz w:val="28"/>
-          <w:szCs w:val="28"/>
-          <w:cs/>
-          <w:lang w:bidi="hi-IN"/>
-        </w:rPr>
-        <w:t xml:space="preserve"> </w:t>
-      </w:r>
-      <w:r>
-        <w:rPr>
-          <w:rFonts w:hint="cs"/>
-          <w:sz w:val="28"/>
-          <w:szCs w:val="28"/>
-          <w:cs/>
-          <w:lang w:bidi="hi-IN"/>
-        </w:rPr>
-        <w:t>अनूठा</w:t>
-      </w:r>
-      <w:r>
-        <w:rPr>
-          <w:rFonts w:hint="cs"/>
-          <w:sz w:val="28"/>
-          <w:szCs w:val="28"/>
-          <w:cs/>
-          <w:lang w:bidi="hi-IN"/>
-        </w:rPr>
-        <w:t xml:space="preserve"> </w:t>
-      </w:r>
-      <w:r>
-        <w:rPr>
-          <w:rFonts w:hint="cs"/>
-          <w:sz w:val="28"/>
-          <w:szCs w:val="28"/>
-          <w:cs/>
-          <w:lang w:bidi="hi-IN"/>
-        </w:rPr>
-        <w:t>अवसर मिलता</w:t>
-      </w:r>
-      <w:r>
-        <w:rPr>
-          <w:rFonts w:hint="cs"/>
-          <w:sz w:val="28"/>
-          <w:szCs w:val="28"/>
-          <w:cs/>
-          <w:lang w:bidi="hi-IN"/>
-        </w:rPr>
-        <w:t xml:space="preserve"> है। </w:t>
-      </w:r>
-    </w:p>
-    <w:p>
-      <w:pPr>
-        <w:rPr>
-          <w:sz w:val="28"/>
-          <w:szCs w:val="28"/>
-          <w:lang w:bidi="hi-IN"/>
-        </w:rPr>
-      </w:pPr>
+        <w:t>प्रदर्शनी स्थल की स्थापना की है।</w:t>
+      </w:r>
       <w:r>
         <w:rPr>
           <w:rFonts w:hint="cs"/>
@@ -4378,8 +3779,620 @@
             </w14:gradFill>
           </w14:textFill>
         </w:rPr>
-        <w:t>ऐसे</w:t>
-      </w:r>
+        <w:t xml:space="preserve"> </w:t>
+      </w:r>
+    </w:p>
+    <w:p>
+      <w:pPr>
+        <w:rPr>
+          <w:sz w:val="28"/>
+          <w:szCs w:val="28"/>
+          <w:lang w:bidi="hi-IN"/>
+        </w:rPr>
+      </w:pPr>
+      <w:r>
+        <w:rPr>
+          <w:rFonts w:hint="cs"/>
+          <w:sz w:val="28"/>
+          <w:szCs w:val="28"/>
+          <w:cs/>
+          <w:lang w:bidi="hi-IN"/>
+        </w:rPr>
+        <w:t>‘</w:t>
+      </w:r>
+      <w:r>
+        <w:rPr>
+          <w:rFonts w:hint="cs"/>
+          <w:sz w:val="28"/>
+          <w:szCs w:val="28"/>
+          <w:cs/>
+          <w:lang w:bidi="hi-IN"/>
+        </w:rPr>
+        <w:t>टीम लैब</w:t>
+      </w:r>
+      <w:r>
+        <w:rPr>
+          <w:rFonts w:hint="cs"/>
+          <w:sz w:val="28"/>
+          <w:szCs w:val="28"/>
+          <w:cs/>
+          <w:lang w:bidi="hi-IN"/>
+        </w:rPr>
+        <w:t>’</w:t>
+      </w:r>
+      <w:r>
+        <w:rPr>
+          <w:rFonts w:hint="cs"/>
+          <w:sz w:val="28"/>
+          <w:szCs w:val="28"/>
+          <w:cs/>
+          <w:lang w:bidi="hi-IN"/>
+        </w:rPr>
+        <w:t xml:space="preserve"> </w:t>
+      </w:r>
+      <w:r>
+        <w:rPr>
+          <w:rFonts w:hint="cs"/>
+          <w:sz w:val="28"/>
+          <w:szCs w:val="28"/>
+          <w:cs/>
+          <w:lang w:bidi="hi-IN"/>
+        </w:rPr>
+        <w:t>की इस</w:t>
+      </w:r>
+      <w:r>
+        <w:rPr>
+          <w:rFonts w:hint="cs"/>
+          <w:sz w:val="28"/>
+          <w:szCs w:val="28"/>
+          <w:cs/>
+          <w:lang w:bidi="hi-IN"/>
+        </w:rPr>
+        <w:t xml:space="preserve"> जादुई</w:t>
+      </w:r>
+      <w:r>
+        <w:rPr>
+          <w:rFonts w:hint="cs"/>
+          <w:sz w:val="28"/>
+          <w:szCs w:val="28"/>
+          <w:cs/>
+          <w:lang w:bidi="hi-IN"/>
+        </w:rPr>
+        <w:t xml:space="preserve"> दुनिया</w:t>
+      </w:r>
+      <w:r>
+        <w:rPr>
+          <w:rFonts w:hint="cs"/>
+          <w:sz w:val="28"/>
+          <w:szCs w:val="28"/>
+          <w:cs/>
+          <w:lang w:bidi="hi-IN"/>
+        </w:rPr>
+        <w:t xml:space="preserve"> </w:t>
+      </w:r>
+      <w:r>
+        <w:rPr>
+          <w:rFonts w:hint="cs"/>
+          <w:sz w:val="28"/>
+          <w:szCs w:val="28"/>
+          <w:cs/>
+          <w:lang w:bidi="hi-IN"/>
+        </w:rPr>
+        <w:t xml:space="preserve">की सैर </w:t>
+      </w:r>
+      <w:r>
+        <w:rPr>
+          <w:rFonts w:hint="cs"/>
+          <w:sz w:val="28"/>
+          <w:szCs w:val="28"/>
+          <w:cs/>
+          <w:lang w:bidi="hi-IN"/>
+        </w:rPr>
+        <w:t>को हलके में न ले..</w:t>
+      </w:r>
+      <w:r>
+        <w:rPr>
+          <w:rFonts w:hint="cs"/>
+          <w:sz w:val="28"/>
+          <w:szCs w:val="28"/>
+          <w:cs/>
+          <w:lang w:bidi="hi-IN"/>
+        </w:rPr>
+        <w:t xml:space="preserve"> इसकी</w:t>
+      </w:r>
+      <w:r>
+        <w:rPr>
+          <w:rFonts w:hint="cs"/>
+          <w:sz w:val="28"/>
+          <w:szCs w:val="28"/>
+          <w:cs/>
+          <w:lang w:bidi="hi-IN"/>
+        </w:rPr>
+        <w:t xml:space="preserve"> </w:t>
+      </w:r>
+      <w:proofErr w:type="spellStart"/>
+      <w:r>
+        <w:rPr>
+          <w:rFonts w:hint="cs"/>
+          <w:sz w:val="28"/>
+          <w:szCs w:val="28"/>
+          <w:cs/>
+          <w:lang w:bidi="hi-IN"/>
+        </w:rPr>
+        <w:t>इंटर</w:t>
+      </w:r>
+      <w:r>
+        <w:rPr>
+          <w:rFonts w:hint="cs"/>
+          <w:sz w:val="28"/>
+          <w:szCs w:val="28"/>
+          <w:cs/>
+          <w:lang w:bidi="hi-IN"/>
+        </w:rPr>
+        <w:t>एक्टिविटी</w:t>
+      </w:r>
+      <w:proofErr w:type="spellEnd"/>
+      <w:r>
+        <w:rPr>
+          <w:rFonts w:hint="cs"/>
+          <w:sz w:val="28"/>
+          <w:szCs w:val="28"/>
+          <w:cs/>
+          <w:lang w:bidi="hi-IN"/>
+        </w:rPr>
+        <w:t>:</w:t>
+      </w:r>
+      <w:r>
+        <w:rPr>
+          <w:rFonts w:hint="cs"/>
+          <w:sz w:val="28"/>
+          <w:szCs w:val="28"/>
+          <w:cs/>
+          <w:lang w:bidi="hi-IN"/>
+        </w:rPr>
+        <w:t xml:space="preserve"> </w:t>
+      </w:r>
+      <w:r>
+        <w:rPr>
+          <w:rFonts w:hint="cs"/>
+          <w:sz w:val="28"/>
+          <w:szCs w:val="28"/>
+          <w:cs/>
+          <w:lang w:bidi="hi-IN"/>
+        </w:rPr>
+        <w:t>(</w:t>
+      </w:r>
+      <w:r>
+        <w:rPr>
+          <w:rFonts w:hint="cs"/>
+          <w:sz w:val="28"/>
+          <w:szCs w:val="28"/>
+          <w:cs/>
+          <w:lang w:bidi="hi-IN"/>
+        </w:rPr>
+        <w:t xml:space="preserve">तकनीकी से लेस कला </w:t>
+      </w:r>
+      <w:r>
+        <w:rPr>
+          <w:rFonts w:hint="cs"/>
+          <w:sz w:val="28"/>
+          <w:szCs w:val="28"/>
+          <w:cs/>
+          <w:lang w:bidi="hi-IN"/>
+        </w:rPr>
+        <w:t>का</w:t>
+      </w:r>
+      <w:r>
+        <w:rPr>
+          <w:rFonts w:hint="cs"/>
+          <w:sz w:val="28"/>
+          <w:szCs w:val="28"/>
+          <w:cs/>
+          <w:lang w:bidi="hi-IN"/>
+        </w:rPr>
+        <w:t xml:space="preserve"> </w:t>
+      </w:r>
+      <w:r>
+        <w:rPr>
+          <w:rFonts w:hint="cs"/>
+          <w:sz w:val="28"/>
+          <w:szCs w:val="28"/>
+          <w:cs/>
+          <w:lang w:bidi="hi-IN"/>
+        </w:rPr>
+        <w:t>परस्पर प्रभाव</w:t>
+      </w:r>
+      <w:r>
+        <w:rPr>
+          <w:rFonts w:hint="cs"/>
+          <w:sz w:val="28"/>
+          <w:szCs w:val="28"/>
+          <w:cs/>
+          <w:lang w:bidi="hi-IN"/>
+        </w:rPr>
+        <w:t xml:space="preserve">) इसे अन्य कला </w:t>
+      </w:r>
+      <w:r>
+        <w:rPr>
+          <w:rFonts w:hint="cs"/>
+          <w:sz w:val="28"/>
+          <w:szCs w:val="28"/>
+          <w:cs/>
+          <w:lang w:bidi="hi-IN"/>
+        </w:rPr>
+        <w:t xml:space="preserve">प्रदर्शनियों से हटकर </w:t>
+      </w:r>
+      <w:r>
+        <w:rPr>
+          <w:rFonts w:hint="cs"/>
+          <w:sz w:val="28"/>
+          <w:szCs w:val="28"/>
+          <w:cs/>
+          <w:lang w:bidi="hi-IN"/>
+        </w:rPr>
+        <w:t xml:space="preserve">एक अलग </w:t>
+      </w:r>
+      <w:r>
+        <w:rPr>
+          <w:rFonts w:hint="cs"/>
+          <w:sz w:val="28"/>
+          <w:szCs w:val="28"/>
+          <w:cs/>
+          <w:lang w:bidi="hi-IN"/>
+        </w:rPr>
+        <w:t>विचार</w:t>
+      </w:r>
+      <w:r>
+        <w:rPr>
+          <w:rFonts w:hint="cs"/>
+          <w:sz w:val="28"/>
+          <w:szCs w:val="28"/>
+          <w:cs/>
+          <w:lang w:bidi="hi-IN"/>
+        </w:rPr>
+        <w:t>-</w:t>
+      </w:r>
+      <w:r>
+        <w:rPr>
+          <w:rFonts w:hint="cs"/>
+          <w:sz w:val="28"/>
+          <w:szCs w:val="28"/>
+          <w:cs/>
+          <w:lang w:bidi="hi-IN"/>
+        </w:rPr>
+        <w:t xml:space="preserve">रूप </w:t>
+      </w:r>
+      <w:r>
+        <w:rPr>
+          <w:rFonts w:hint="cs"/>
+          <w:sz w:val="28"/>
+          <w:szCs w:val="28"/>
+          <w:cs/>
+          <w:lang w:bidi="hi-IN"/>
+        </w:rPr>
+        <w:t xml:space="preserve">पर </w:t>
+      </w:r>
+      <w:r>
+        <w:rPr>
+          <w:rFonts w:hint="cs"/>
+          <w:sz w:val="28"/>
+          <w:szCs w:val="28"/>
+          <w:cs/>
+          <w:lang w:bidi="hi-IN"/>
+        </w:rPr>
+        <w:t>बनाया गया है</w:t>
+      </w:r>
+      <w:r>
+        <w:rPr>
+          <w:rFonts w:hint="cs"/>
+          <w:sz w:val="28"/>
+          <w:szCs w:val="28"/>
+          <w:cs/>
+          <w:lang w:bidi="hi-IN"/>
+        </w:rPr>
+        <w:t>।</w:t>
+      </w:r>
+      <w:r>
+        <w:rPr>
+          <w:rFonts w:hint="cs"/>
+          <w:sz w:val="28"/>
+          <w:szCs w:val="28"/>
+          <w:cs/>
+          <w:lang w:bidi="hi-IN"/>
+        </w:rPr>
+        <w:t xml:space="preserve"> हर उम्र के </w:t>
+      </w:r>
+      <w:r>
+        <w:rPr>
+          <w:rFonts w:hint="cs"/>
+          <w:sz w:val="28"/>
+          <w:szCs w:val="28"/>
+          <w:cs/>
+          <w:lang w:bidi="hi-IN"/>
+        </w:rPr>
+        <w:t xml:space="preserve">दर्शकों  </w:t>
+      </w:r>
+      <w:r>
+        <w:rPr>
+          <w:rFonts w:hint="cs"/>
+          <w:sz w:val="28"/>
+          <w:szCs w:val="28"/>
+          <w:cs/>
+          <w:lang w:bidi="hi-IN"/>
+        </w:rPr>
+        <w:t xml:space="preserve">को </w:t>
+      </w:r>
+      <w:r>
+        <w:rPr>
+          <w:rFonts w:hint="cs"/>
+          <w:sz w:val="28"/>
+          <w:szCs w:val="28"/>
+          <w:cs/>
+          <w:lang w:bidi="hi-IN"/>
+        </w:rPr>
+        <w:t>डिजिटल</w:t>
+      </w:r>
+      <w:r>
+        <w:rPr>
+          <w:rFonts w:hint="cs"/>
+          <w:sz w:val="28"/>
+          <w:szCs w:val="28"/>
+          <w:cs/>
+          <w:lang w:bidi="hi-IN"/>
+        </w:rPr>
+        <w:t xml:space="preserve"> </w:t>
+      </w:r>
+      <w:r>
+        <w:rPr>
+          <w:rFonts w:hint="cs"/>
+          <w:sz w:val="28"/>
+          <w:szCs w:val="28"/>
+          <w:cs/>
+          <w:lang w:bidi="hi-IN"/>
+        </w:rPr>
+        <w:t>प्रोग्रामिंग</w:t>
+      </w:r>
+      <w:r>
+        <w:rPr>
+          <w:rFonts w:hint="cs"/>
+          <w:sz w:val="28"/>
+          <w:szCs w:val="28"/>
+          <w:cs/>
+          <w:lang w:bidi="hi-IN"/>
+        </w:rPr>
+        <w:t xml:space="preserve"> </w:t>
+      </w:r>
+      <w:r>
+        <w:rPr>
+          <w:rFonts w:hint="cs"/>
+          <w:sz w:val="28"/>
+          <w:szCs w:val="28"/>
+          <w:cs/>
+          <w:lang w:bidi="hi-IN"/>
+        </w:rPr>
+        <w:t>से</w:t>
+      </w:r>
+      <w:r>
+        <w:rPr>
+          <w:rFonts w:hint="cs"/>
+          <w:sz w:val="28"/>
+          <w:szCs w:val="28"/>
+          <w:cs/>
+          <w:lang w:bidi="hi-IN"/>
+        </w:rPr>
+        <w:t xml:space="preserve"> </w:t>
+      </w:r>
+      <w:r>
+        <w:rPr>
+          <w:rFonts w:hint="cs"/>
+          <w:sz w:val="28"/>
+          <w:szCs w:val="28"/>
+          <w:cs/>
+          <w:lang w:bidi="hi-IN"/>
+        </w:rPr>
+        <w:t>गुरुत्वाकर्षण</w:t>
+      </w:r>
+      <w:r>
+        <w:rPr>
+          <w:rFonts w:hint="cs"/>
+          <w:sz w:val="28"/>
+          <w:szCs w:val="28"/>
+          <w:cs/>
+          <w:lang w:bidi="hi-IN"/>
+        </w:rPr>
+        <w:t xml:space="preserve"> </w:t>
+      </w:r>
+      <w:r>
+        <w:rPr>
+          <w:rFonts w:hint="cs"/>
+          <w:sz w:val="28"/>
+          <w:szCs w:val="28"/>
+          <w:cs/>
+          <w:lang w:bidi="hi-IN"/>
+        </w:rPr>
+        <w:t>(</w:t>
+      </w:r>
+      <w:proofErr w:type="spellStart"/>
+      <w:r>
+        <w:rPr>
+          <w:rFonts w:hint="cs"/>
+          <w:sz w:val="28"/>
+          <w:szCs w:val="28"/>
+          <w:cs/>
+          <w:lang w:bidi="hi-IN"/>
+        </w:rPr>
+        <w:t>ग</w:t>
+      </w:r>
+      <w:r>
+        <w:rPr>
+          <w:rFonts w:hint="cs"/>
+          <w:sz w:val="28"/>
+          <w:szCs w:val="28"/>
+          <w:cs/>
+          <w:lang w:bidi="hi-IN"/>
+        </w:rPr>
+        <w:t>्रे</w:t>
+      </w:r>
+      <w:r>
+        <w:rPr>
+          <w:rFonts w:hint="cs"/>
+          <w:sz w:val="28"/>
+          <w:szCs w:val="28"/>
+          <w:cs/>
+          <w:lang w:bidi="hi-IN"/>
+        </w:rPr>
+        <w:t>विटी</w:t>
+      </w:r>
+      <w:proofErr w:type="spellEnd"/>
+      <w:r>
+        <w:rPr>
+          <w:rFonts w:hint="cs"/>
+          <w:sz w:val="28"/>
+          <w:szCs w:val="28"/>
+          <w:cs/>
+          <w:lang w:bidi="hi-IN"/>
+        </w:rPr>
+        <w:t>)</w:t>
+      </w:r>
+      <w:r>
+        <w:rPr>
+          <w:rFonts w:hint="cs"/>
+          <w:sz w:val="28"/>
+          <w:szCs w:val="28"/>
+          <w:cs/>
+          <w:lang w:bidi="hi-IN"/>
+        </w:rPr>
+        <w:t xml:space="preserve"> में तैरती </w:t>
+      </w:r>
+      <w:r>
+        <w:rPr>
+          <w:rFonts w:hint="cs"/>
+          <w:sz w:val="28"/>
+          <w:szCs w:val="28"/>
+          <w:cs/>
+          <w:lang w:bidi="hi-IN"/>
+        </w:rPr>
+        <w:t>कलाकृतियों</w:t>
+      </w:r>
+      <w:r>
+        <w:rPr>
+          <w:rFonts w:hint="cs"/>
+          <w:sz w:val="28"/>
+          <w:szCs w:val="28"/>
+          <w:cs/>
+          <w:lang w:bidi="hi-IN"/>
+        </w:rPr>
+        <w:t xml:space="preserve"> क</w:t>
+      </w:r>
+      <w:r>
+        <w:rPr>
+          <w:rFonts w:hint="cs"/>
+          <w:sz w:val="28"/>
+          <w:szCs w:val="28"/>
+          <w:cs/>
+          <w:lang w:bidi="hi-IN"/>
+        </w:rPr>
+        <w:t>े</w:t>
+      </w:r>
+      <w:r>
+        <w:rPr>
+          <w:rFonts w:hint="cs"/>
+          <w:sz w:val="28"/>
+          <w:szCs w:val="28"/>
+          <w:cs/>
+          <w:lang w:bidi="hi-IN"/>
+        </w:rPr>
+        <w:t xml:space="preserve"> प्रदर्शन</w:t>
+      </w:r>
+      <w:r>
+        <w:rPr>
+          <w:rFonts w:hint="cs"/>
+          <w:sz w:val="28"/>
+          <w:szCs w:val="28"/>
+          <w:cs/>
+          <w:lang w:bidi="hi-IN"/>
+        </w:rPr>
+        <w:t xml:space="preserve"> </w:t>
+      </w:r>
+      <w:r>
+        <w:rPr>
+          <w:rFonts w:hint="cs"/>
+          <w:sz w:val="28"/>
+          <w:szCs w:val="28"/>
+          <w:cs/>
+          <w:lang w:bidi="hi-IN"/>
+        </w:rPr>
+        <w:t>में शामिल</w:t>
+      </w:r>
+      <w:r>
+        <w:rPr>
+          <w:rFonts w:hint="cs"/>
+          <w:sz w:val="28"/>
+          <w:szCs w:val="28"/>
+          <w:cs/>
+          <w:lang w:bidi="hi-IN"/>
+        </w:rPr>
+        <w:t xml:space="preserve"> होने का</w:t>
+      </w:r>
+      <w:r>
+        <w:rPr>
+          <w:rFonts w:hint="cs"/>
+          <w:sz w:val="28"/>
+          <w:szCs w:val="28"/>
+          <w:cs/>
+          <w:lang w:bidi="hi-IN"/>
+        </w:rPr>
+        <w:t xml:space="preserve"> </w:t>
+      </w:r>
+      <w:r>
+        <w:rPr>
+          <w:rFonts w:hint="cs"/>
+          <w:sz w:val="28"/>
+          <w:szCs w:val="28"/>
+          <w:cs/>
+          <w:lang w:bidi="hi-IN"/>
+        </w:rPr>
+        <w:t>अनूठा</w:t>
+      </w:r>
+      <w:r>
+        <w:rPr>
+          <w:rFonts w:hint="cs"/>
+          <w:sz w:val="28"/>
+          <w:szCs w:val="28"/>
+          <w:cs/>
+          <w:lang w:bidi="hi-IN"/>
+        </w:rPr>
+        <w:t xml:space="preserve"> </w:t>
+      </w:r>
+      <w:r>
+        <w:rPr>
+          <w:rFonts w:hint="cs"/>
+          <w:sz w:val="28"/>
+          <w:szCs w:val="28"/>
+          <w:cs/>
+          <w:lang w:bidi="hi-IN"/>
+        </w:rPr>
+        <w:t>अवसर मिलता</w:t>
+      </w:r>
+      <w:r>
+        <w:rPr>
+          <w:rFonts w:hint="cs"/>
+          <w:sz w:val="28"/>
+          <w:szCs w:val="28"/>
+          <w:cs/>
+          <w:lang w:bidi="hi-IN"/>
+        </w:rPr>
+        <w:t xml:space="preserve"> है। </w:t>
+      </w:r>
+    </w:p>
+    <w:p>
+      <w:pPr>
+        <w:rPr>
+          <w:sz w:val="28"/>
+          <w:szCs w:val="28"/>
+          <w:lang w:bidi="hi-IN"/>
+        </w:rPr>
+      </w:pPr>
       <w:r>
         <w:rPr>
           <w:rFonts w:hint="cs"/>
@@ -4415,7 +4428,7 @@
             </w14:gradFill>
           </w14:textFill>
         </w:rPr>
-        <w:t xml:space="preserve"> </w:t>
+        <w:t>ऐसे</w:t>
       </w:r>
       <w:r>
         <w:rPr>
@@ -4452,7 +4465,7 @@
             </w14:gradFill>
           </w14:textFill>
         </w:rPr>
-        <w:t>अनेक</w:t>
+        <w:t xml:space="preserve"> </w:t>
       </w:r>
       <w:r>
         <w:rPr>
@@ -4489,7 +4502,7 @@
             </w14:gradFill>
           </w14:textFill>
         </w:rPr>
-        <w:t xml:space="preserve"> मनमोहक</w:t>
+        <w:t>अनेक</w:t>
       </w:r>
       <w:r>
         <w:rPr>
@@ -4526,7 +4539,7 @@
             </w14:gradFill>
           </w14:textFill>
         </w:rPr>
-        <w:t xml:space="preserve"> </w:t>
+        <w:t xml:space="preserve"> मनमोहक</w:t>
       </w:r>
       <w:r>
         <w:rPr>
@@ -4563,7 +4576,7 @@
             </w14:gradFill>
           </w14:textFill>
         </w:rPr>
-        <w:t>दृश्यों के बीच</w:t>
+        <w:t xml:space="preserve"> </w:t>
       </w:r>
       <w:r>
         <w:rPr>
@@ -4600,7 +4613,7 @@
             </w14:gradFill>
           </w14:textFill>
         </w:rPr>
-        <w:t xml:space="preserve"> उ</w:t>
+        <w:t>दृश्यों के बीच</w:t>
       </w:r>
       <w:r>
         <w:rPr>
@@ -4637,7 +4650,7 @@
             </w14:gradFill>
           </w14:textFill>
         </w:rPr>
-        <w:t>नका</w:t>
+        <w:t xml:space="preserve"> उ</w:t>
       </w:r>
       <w:r>
         <w:rPr>
@@ -4674,7 +4687,7 @@
             </w14:gradFill>
           </w14:textFill>
         </w:rPr>
-        <w:t xml:space="preserve"> </w:t>
+        <w:t>नका</w:t>
       </w:r>
       <w:r>
         <w:rPr>
@@ -4711,7 +4724,7 @@
             </w14:gradFill>
           </w14:textFill>
         </w:rPr>
-        <w:t xml:space="preserve">हिस्सा बने </w:t>
+        <w:t xml:space="preserve"> </w:t>
       </w:r>
       <w:r>
         <w:rPr>
@@ -4748,7 +4761,7 @@
             </w14:gradFill>
           </w14:textFill>
         </w:rPr>
-        <w:t>रहना</w:t>
+        <w:t xml:space="preserve">हिस्सा बने </w:t>
       </w:r>
       <w:r>
         <w:rPr>
@@ -4785,7 +4798,7 @@
             </w14:gradFill>
           </w14:textFill>
         </w:rPr>
-        <w:t>...</w:t>
+        <w:t>रहना</w:t>
       </w:r>
       <w:r>
         <w:rPr>
@@ -4822,7 +4835,7 @@
             </w14:gradFill>
           </w14:textFill>
         </w:rPr>
-        <w:t>सच</w:t>
+        <w:t>...</w:t>
       </w:r>
       <w:r>
         <w:rPr>
@@ -4859,7 +4872,7 @@
             </w14:gradFill>
           </w14:textFill>
         </w:rPr>
-        <w:t xml:space="preserve"> में</w:t>
+        <w:t>सच</w:t>
       </w:r>
       <w:r>
         <w:rPr>
@@ -4896,7 +4909,7 @@
             </w14:gradFill>
           </w14:textFill>
         </w:rPr>
-        <w:t xml:space="preserve"> </w:t>
+        <w:t xml:space="preserve"> में</w:t>
       </w:r>
       <w:r>
         <w:rPr>
@@ -4933,7 +4946,7 @@
             </w14:gradFill>
           </w14:textFill>
         </w:rPr>
-        <w:t xml:space="preserve">रोमांचित </w:t>
+        <w:t xml:space="preserve"> </w:t>
       </w:r>
       <w:r>
         <w:rPr>
@@ -4970,7 +4983,7 @@
             </w14:gradFill>
           </w14:textFill>
         </w:rPr>
-        <w:t>अनुभव है।</w:t>
+        <w:t xml:space="preserve">रोमांचित </w:t>
       </w:r>
       <w:r>
         <w:rPr>
@@ -5007,623 +5020,590 @@
             </w14:gradFill>
           </w14:textFill>
         </w:rPr>
-        <w:t xml:space="preserve"> </w:t>
-      </w:r>
-      <w:r>
-        <w:rPr>
-          <w:rFonts w:hint="cs"/>
-          <w:sz w:val="28"/>
-          <w:szCs w:val="28"/>
-          <w:cs/>
-          <w:lang w:bidi="hi-IN"/>
-        </w:rPr>
-        <w:t>दुनिया</w:t>
-      </w:r>
-      <w:r>
-        <w:rPr>
-          <w:rFonts w:hint="cs"/>
-          <w:sz w:val="28"/>
-          <w:szCs w:val="28"/>
-          <w:cs/>
-          <w:lang w:bidi="hi-IN"/>
-        </w:rPr>
-        <w:t>भर से</w:t>
-      </w:r>
-      <w:r>
-        <w:rPr>
-          <w:rFonts w:hint="cs"/>
-          <w:sz w:val="28"/>
-          <w:szCs w:val="28"/>
-          <w:cs/>
-          <w:lang w:bidi="hi-IN"/>
-        </w:rPr>
-        <w:t xml:space="preserve"> कई देशों </w:t>
-      </w:r>
-      <w:r>
-        <w:rPr>
-          <w:rFonts w:hint="cs"/>
-          <w:sz w:val="28"/>
-          <w:szCs w:val="28"/>
-          <w:cs/>
-          <w:lang w:bidi="hi-IN"/>
-        </w:rPr>
-        <w:t>की</w:t>
-      </w:r>
-      <w:r>
-        <w:rPr>
-          <w:rFonts w:hint="cs"/>
-          <w:sz w:val="28"/>
-          <w:szCs w:val="28"/>
-          <w:cs/>
-          <w:lang w:bidi="hi-IN"/>
-        </w:rPr>
-        <w:t xml:space="preserve"> </w:t>
-      </w:r>
-      <w:r>
-        <w:rPr>
-          <w:rFonts w:hint="cs"/>
-          <w:sz w:val="28"/>
-          <w:szCs w:val="28"/>
-          <w:cs/>
-          <w:lang w:bidi="hi-IN"/>
-        </w:rPr>
-        <w:t xml:space="preserve">इस </w:t>
-      </w:r>
-      <w:r>
-        <w:rPr>
-          <w:rFonts w:hint="cs"/>
-          <w:sz w:val="28"/>
-          <w:szCs w:val="28"/>
-          <w:cs/>
-          <w:lang w:bidi="hi-IN"/>
-        </w:rPr>
-        <w:t>संकल्पना</w:t>
-      </w:r>
-      <w:r>
-        <w:rPr>
-          <w:rFonts w:hint="cs"/>
-          <w:sz w:val="28"/>
-          <w:szCs w:val="28"/>
-          <w:cs/>
-          <w:lang w:bidi="hi-IN"/>
-        </w:rPr>
-        <w:t xml:space="preserve"> पर </w:t>
-      </w:r>
-      <w:r>
-        <w:rPr>
-          <w:rFonts w:hint="cs"/>
-          <w:sz w:val="28"/>
-          <w:szCs w:val="28"/>
-          <w:cs/>
-          <w:lang w:bidi="hi-IN"/>
-        </w:rPr>
-        <w:t xml:space="preserve">बनी </w:t>
-      </w:r>
-      <w:r>
-        <w:rPr>
-          <w:rFonts w:hint="cs"/>
-          <w:sz w:val="28"/>
-          <w:szCs w:val="28"/>
-          <w:cs/>
-          <w:lang w:bidi="hi-IN"/>
-        </w:rPr>
-        <w:t xml:space="preserve">प्रदर्शनियों </w:t>
-      </w:r>
-      <w:r>
-        <w:rPr>
-          <w:rFonts w:hint="cs"/>
-          <w:sz w:val="28"/>
-          <w:szCs w:val="28"/>
-          <w:cs/>
-          <w:lang w:bidi="hi-IN"/>
-        </w:rPr>
-        <w:t xml:space="preserve">लाखों को आकर्षित </w:t>
-      </w:r>
-      <w:r>
-        <w:rPr>
-          <w:rFonts w:hint="cs"/>
-          <w:sz w:val="28"/>
-          <w:szCs w:val="28"/>
-          <w:cs/>
-          <w:lang w:bidi="hi-IN"/>
-        </w:rPr>
-        <w:t>कर चुकी है।</w:t>
-      </w:r>
-      <w:r>
-        <w:rPr>
-          <w:rFonts w:hint="cs"/>
-          <w:sz w:val="28"/>
-          <w:szCs w:val="28"/>
-          <w:cs/>
-          <w:lang w:bidi="hi-IN"/>
-        </w:rPr>
-        <w:t xml:space="preserve"> </w:t>
-      </w:r>
-      <w:r>
-        <w:rPr>
-          <w:rFonts w:hint="cs"/>
-          <w:sz w:val="28"/>
-          <w:szCs w:val="28"/>
-          <w:cs/>
-          <w:lang w:bidi="hi-IN"/>
-        </w:rPr>
-        <w:t>वैश्विक</w:t>
-      </w:r>
-      <w:r>
-        <w:rPr>
-          <w:rFonts w:hint="cs"/>
-          <w:sz w:val="28"/>
-          <w:szCs w:val="28"/>
-          <w:cs/>
-          <w:lang w:bidi="hi-IN"/>
-        </w:rPr>
-        <w:t xml:space="preserve"> </w:t>
-      </w:r>
-      <w:r>
-        <w:rPr>
-          <w:rFonts w:hint="cs"/>
-          <w:sz w:val="28"/>
-          <w:szCs w:val="28"/>
-          <w:cs/>
-          <w:lang w:bidi="hi-IN"/>
-        </w:rPr>
-        <w:t>लोकप्रियता</w:t>
-      </w:r>
-      <w:r>
-        <w:rPr>
-          <w:rFonts w:hint="cs"/>
-          <w:sz w:val="28"/>
-          <w:szCs w:val="28"/>
-          <w:cs/>
-          <w:lang w:bidi="hi-IN"/>
-        </w:rPr>
-        <w:t xml:space="preserve"> </w:t>
-      </w:r>
-      <w:r>
-        <w:rPr>
-          <w:rFonts w:hint="cs"/>
-          <w:sz w:val="28"/>
-          <w:szCs w:val="28"/>
-          <w:cs/>
-          <w:lang w:bidi="hi-IN"/>
-        </w:rPr>
-        <w:t xml:space="preserve">में </w:t>
-      </w:r>
-      <w:r>
-        <w:rPr>
-          <w:rFonts w:hint="cs"/>
-          <w:sz w:val="28"/>
-          <w:szCs w:val="28"/>
-          <w:cs/>
-          <w:lang w:bidi="hi-IN"/>
-        </w:rPr>
-        <w:t>‘</w:t>
-      </w:r>
-      <w:r>
-        <w:rPr>
-          <w:rFonts w:hint="cs"/>
-          <w:sz w:val="28"/>
-          <w:szCs w:val="28"/>
-          <w:cs/>
-          <w:lang w:bidi="hi-IN"/>
-        </w:rPr>
-        <w:t>टीम लैब</w:t>
-      </w:r>
-      <w:r>
-        <w:rPr>
-          <w:rFonts w:hint="cs"/>
-          <w:sz w:val="28"/>
-          <w:szCs w:val="28"/>
-          <w:cs/>
-          <w:lang w:bidi="hi-IN"/>
-        </w:rPr>
-        <w:t>’</w:t>
-      </w:r>
-      <w:r>
-        <w:rPr>
-          <w:rFonts w:hint="cs"/>
-          <w:sz w:val="28"/>
-          <w:szCs w:val="28"/>
-          <w:cs/>
-          <w:lang w:bidi="hi-IN"/>
-        </w:rPr>
-        <w:t xml:space="preserve"> </w:t>
-      </w:r>
-      <w:r>
-        <w:rPr>
-          <w:rFonts w:hint="cs"/>
-          <w:sz w:val="28"/>
-          <w:szCs w:val="28"/>
-          <w:cs/>
-          <w:lang w:bidi="hi-IN"/>
-        </w:rPr>
-        <w:t xml:space="preserve">को </w:t>
-      </w:r>
-      <w:r>
-        <w:rPr>
-          <w:rFonts w:hint="cs"/>
-          <w:sz w:val="28"/>
-          <w:szCs w:val="28"/>
-          <w:cs/>
-          <w:lang w:bidi="hi-IN"/>
-        </w:rPr>
-        <w:t xml:space="preserve">एक </w:t>
-      </w:r>
-      <w:r>
-        <w:rPr>
-          <w:rFonts w:hint="cs"/>
-          <w:sz w:val="28"/>
-          <w:szCs w:val="28"/>
-          <w:cs/>
-          <w:lang w:bidi="hi-IN"/>
-        </w:rPr>
-        <w:t>विश्वव्यापी</w:t>
-      </w:r>
-      <w:r>
-        <w:rPr>
-          <w:rFonts w:hint="cs"/>
-          <w:sz w:val="28"/>
-          <w:szCs w:val="28"/>
-          <w:cs/>
-          <w:lang w:bidi="hi-IN"/>
-        </w:rPr>
-        <w:t xml:space="preserve"> </w:t>
-      </w:r>
-      <w:r>
-        <w:rPr>
-          <w:rFonts w:hint="cs"/>
-          <w:sz w:val="28"/>
-          <w:szCs w:val="28"/>
-          <w:cs/>
-          <w:lang w:bidi="hi-IN"/>
-        </w:rPr>
-        <w:t>ट्रे</w:t>
-      </w:r>
-      <w:r>
-        <w:rPr>
-          <w:rFonts w:hint="cs"/>
-          <w:sz w:val="28"/>
-          <w:szCs w:val="28"/>
-          <w:cs/>
-          <w:lang w:bidi="hi-IN"/>
-        </w:rPr>
-        <w:t>ं</w:t>
-      </w:r>
-      <w:r>
-        <w:rPr>
-          <w:rFonts w:hint="cs"/>
-          <w:sz w:val="28"/>
-          <w:szCs w:val="28"/>
-          <w:cs/>
-          <w:lang w:bidi="hi-IN"/>
-        </w:rPr>
-        <w:t>ड</w:t>
-      </w:r>
-      <w:r>
-        <w:rPr>
-          <w:rFonts w:hint="cs"/>
-          <w:sz w:val="28"/>
-          <w:szCs w:val="28"/>
-          <w:cs/>
-          <w:lang w:bidi="hi-IN"/>
-        </w:rPr>
-        <w:t xml:space="preserve"> </w:t>
-      </w:r>
-      <w:r>
-        <w:rPr>
-          <w:rFonts w:hint="cs"/>
-          <w:sz w:val="28"/>
-          <w:szCs w:val="28"/>
-          <w:cs/>
-          <w:lang w:bidi="hi-IN"/>
-        </w:rPr>
-        <w:t>का दर्जा</w:t>
-      </w:r>
-      <w:r>
-        <w:rPr>
-          <w:rFonts w:hint="cs"/>
-          <w:sz w:val="28"/>
-          <w:szCs w:val="28"/>
-          <w:cs/>
-          <w:lang w:bidi="hi-IN"/>
-        </w:rPr>
-        <w:t xml:space="preserve"> </w:t>
-      </w:r>
-      <w:r>
-        <w:rPr>
-          <w:rFonts w:hint="cs"/>
-          <w:sz w:val="28"/>
-          <w:szCs w:val="28"/>
-          <w:cs/>
-          <w:lang w:bidi="hi-IN"/>
-        </w:rPr>
-        <w:t>प्राप्त</w:t>
-      </w:r>
-      <w:r>
-        <w:rPr>
-          <w:rFonts w:hint="cs"/>
-          <w:sz w:val="28"/>
-          <w:szCs w:val="28"/>
-          <w:cs/>
-          <w:lang w:bidi="hi-IN"/>
-        </w:rPr>
-        <w:t xml:space="preserve"> </w:t>
-      </w:r>
-      <w:r>
-        <w:rPr>
-          <w:rFonts w:hint="cs"/>
-          <w:sz w:val="28"/>
-          <w:szCs w:val="28"/>
-          <w:cs/>
-          <w:lang w:bidi="hi-IN"/>
-        </w:rPr>
-        <w:t>है।</w:t>
-      </w:r>
-      <w:r>
-        <w:rPr>
-          <w:rFonts w:hint="cs"/>
-          <w:sz w:val="28"/>
-          <w:szCs w:val="28"/>
-          <w:cs/>
-          <w:lang w:bidi="hi-IN"/>
-        </w:rPr>
-        <w:t xml:space="preserve"> </w:t>
-      </w:r>
-      <w:r>
-        <w:rPr>
-          <w:rFonts w:hint="cs"/>
-          <w:sz w:val="28"/>
-          <w:szCs w:val="28"/>
-          <w:cs/>
-          <w:lang w:bidi="hi-IN"/>
-        </w:rPr>
-        <w:t>इन</w:t>
-      </w:r>
-      <w:r>
-        <w:rPr>
-          <w:rFonts w:hint="cs"/>
-          <w:sz w:val="28"/>
-          <w:szCs w:val="28"/>
-          <w:cs/>
-          <w:lang w:bidi="hi-IN"/>
-        </w:rPr>
-        <w:t xml:space="preserve"> </w:t>
-      </w:r>
-      <w:r>
-        <w:rPr>
-          <w:rFonts w:hint="cs"/>
-          <w:sz w:val="28"/>
-          <w:szCs w:val="28"/>
-          <w:cs/>
-          <w:lang w:bidi="hi-IN"/>
-        </w:rPr>
-        <w:t>क</w:t>
-      </w:r>
-      <w:r>
-        <w:rPr>
-          <w:rFonts w:hint="cs"/>
-          <w:sz w:val="28"/>
-          <w:szCs w:val="28"/>
-          <w:cs/>
-          <w:lang w:bidi="hi-IN"/>
-        </w:rPr>
-        <w:t xml:space="preserve">ला </w:t>
-      </w:r>
-      <w:r>
-        <w:rPr>
-          <w:rFonts w:hint="cs"/>
-          <w:sz w:val="28"/>
-          <w:szCs w:val="28"/>
-          <w:cs/>
-          <w:lang w:bidi="hi-IN"/>
-        </w:rPr>
-        <w:t>संग्रहालयों</w:t>
-      </w:r>
-      <w:r>
-        <w:rPr>
-          <w:rFonts w:hint="cs"/>
-          <w:sz w:val="28"/>
-          <w:szCs w:val="28"/>
-          <w:cs/>
-          <w:lang w:bidi="hi-IN"/>
-        </w:rPr>
-        <w:t xml:space="preserve"> क</w:t>
-      </w:r>
-      <w:r>
-        <w:rPr>
-          <w:rFonts w:hint="cs"/>
-          <w:sz w:val="28"/>
-          <w:szCs w:val="28"/>
-          <w:cs/>
-          <w:lang w:bidi="hi-IN"/>
-        </w:rPr>
-        <w:t>ा</w:t>
-      </w:r>
-      <w:r>
-        <w:rPr>
-          <w:rFonts w:hint="cs"/>
-          <w:sz w:val="28"/>
-          <w:szCs w:val="28"/>
-          <w:cs/>
-          <w:lang w:bidi="hi-IN"/>
-        </w:rPr>
-        <w:t xml:space="preserve"> </w:t>
-      </w:r>
-      <w:r>
-        <w:rPr>
-          <w:rFonts w:hint="cs"/>
-          <w:sz w:val="28"/>
-          <w:szCs w:val="28"/>
-          <w:cs/>
-          <w:lang w:bidi="hi-IN"/>
-        </w:rPr>
-        <w:t xml:space="preserve">असाधारण योगदान </w:t>
-      </w:r>
-      <w:r>
-        <w:rPr>
-          <w:rFonts w:hint="cs"/>
-          <w:sz w:val="28"/>
-          <w:szCs w:val="28"/>
-          <w:cs/>
-          <w:lang w:bidi="hi-IN"/>
-        </w:rPr>
-        <w:t>ही इसकी</w:t>
-      </w:r>
-      <w:r>
-        <w:rPr>
-          <w:rFonts w:hint="cs"/>
-          <w:sz w:val="28"/>
-          <w:szCs w:val="28"/>
-          <w:cs/>
-          <w:lang w:bidi="hi-IN"/>
-        </w:rPr>
-        <w:t xml:space="preserve"> </w:t>
-      </w:r>
-      <w:r>
-        <w:rPr>
-          <w:rFonts w:hint="cs"/>
-          <w:sz w:val="28"/>
-          <w:szCs w:val="28"/>
-          <w:cs/>
-          <w:lang w:bidi="hi-IN"/>
-        </w:rPr>
-        <w:t>उपलब्धि</w:t>
-      </w:r>
-      <w:r>
-        <w:rPr>
-          <w:rFonts w:hint="cs"/>
-          <w:sz w:val="28"/>
-          <w:szCs w:val="28"/>
-          <w:cs/>
-          <w:lang w:bidi="hi-IN"/>
-        </w:rPr>
-        <w:t xml:space="preserve"> </w:t>
-      </w:r>
-      <w:r>
-        <w:rPr>
-          <w:rFonts w:hint="cs"/>
-          <w:sz w:val="28"/>
-          <w:szCs w:val="28"/>
-          <w:cs/>
-          <w:lang w:bidi="hi-IN"/>
-        </w:rPr>
-        <w:t>व</w:t>
-      </w:r>
-      <w:r>
-        <w:rPr>
-          <w:rFonts w:hint="cs"/>
-          <w:sz w:val="28"/>
-          <w:szCs w:val="28"/>
-          <w:cs/>
-          <w:lang w:bidi="hi-IN"/>
-        </w:rPr>
-        <w:t xml:space="preserve"> </w:t>
-      </w:r>
-      <w:r>
-        <w:rPr>
-          <w:rFonts w:hint="cs"/>
-          <w:sz w:val="28"/>
-          <w:szCs w:val="28"/>
-          <w:cs/>
-          <w:lang w:bidi="hi-IN"/>
-        </w:rPr>
-        <w:t>खासियत है</w:t>
-      </w:r>
-      <w:r>
-        <w:rPr>
-          <w:rFonts w:hint="cs"/>
-          <w:sz w:val="28"/>
-          <w:szCs w:val="28"/>
-          <w:cs/>
-          <w:lang w:bidi="hi-IN"/>
-        </w:rPr>
-        <w:t>।</w:t>
-      </w:r>
-    </w:p>
-    <w:p>
-      <w:pPr>
-        <w:jc w:val="center"/>
-        <w:rPr>
-          <w:bCs/>
-          <w:outline/>
-          <w:color w:val="E97132" w:themeColor="accent2"/>
-          <w:sz w:val="32"/>
-          <w:szCs w:val="32"/>
-          <w:lang w:bidi="hi-IN"/>
-          <w14:shadow w14:blurRad="0" w14:dist="38100" w14:dir="2700000" w14:sx="100000" w14:sy="100000" w14:kx="0" w14:ky="0" w14:algn="tl">
-            <w14:schemeClr w14:val="accent2"/>
-          </w14:shadow>
-          <w14:textOutline w14:w="6604" w14:cap="flat" w14:cmpd="sng" w14:algn="ctr">
-            <w14:solidFill>
-              <w14:schemeClr w14:val="accent2"/>
-            </w14:solidFill>
+        <w:t>अनुभव है।</w:t>
+      </w:r>
+      <w:r>
+        <w:rPr>
+          <w:rFonts w:hint="cs"/>
+          <w:sz w:val="28"/>
+          <w:szCs w:val="28"/>
+          <w:cs/>
+          <w:lang w:bidi="hi-IN"/>
+          <w14:reflection w14:blurRad="6350" w14:stA="53000" w14:stPos="0" w14:endA="300" w14:endPos="35500" w14:dist="0" w14:dir="5400000" w14:fadeDir="5400000" w14:sx="100000" w14:sy="-90000" w14:kx="0" w14:ky="0" w14:algn="bl"/>
+          <w14:textOutline w14:w="0" w14:cap="flat" w14:cmpd="sng" w14:algn="ctr">
+            <w14:noFill/>
             <w14:prstDash w14:val="solid"/>
             <w14:round/>
           </w14:textOutline>
           <w14:textFill>
-            <w14:solidFill>
-              <w14:srgbClr w14:val="FFFFFF"/>
-            </w14:solidFill>
+            <w14:gradFill>
+              <w14:gsLst>
+                <w14:gs w14:pos="0">
+                  <w14:schemeClr w14:val="accent5">
+                    <w14:lumMod w14:val="50000"/>
+                  </w14:schemeClr>
+                </w14:gs>
+                <w14:gs w14:pos="50000">
+                  <w14:schemeClr w14:val="accent5"/>
+                </w14:gs>
+                <w14:gs w14:pos="100000">
+                  <w14:schemeClr w14:val="accent5">
+                    <w14:lumMod w14:val="60000"/>
+                    <w14:lumOff w14:val="40000"/>
+                  </w14:schemeClr>
+                </w14:gs>
+              </w14:gsLst>
+              <w14:lin w14:ang="5400000" w14:scaled="0"/>
+            </w14:gradFill>
           </w14:textFill>
         </w:rPr>
-      </w:pPr>
-      <w:r>
-        <w:rPr>
-          <w:bCs/>
-          <w:outline/>
-          <w:noProof/>
-          <w:color w:val="FFFFFF"/>
-          <w:sz w:val="32"/>
-          <w:szCs w:val="32"/>
-          <w:lang w:bidi="hi-IN"/>
-        </w:rPr>
-        <w:lastRenderedPageBreak/>
-        <w:drawing>
-          <wp:inline distT="0" distB="0" distL="0" distR="0" wp14:anchorId="481559EE" wp14:editId="62D9ED90">
-            <wp:extent cx="2794000" cy="1303867"/>
-            <wp:effectExtent l="0" t="0" r="6350" b="0"/>
-            <wp:docPr id="476529727" name="Graphic 1"/>
-            <wp:cNvGraphicFramePr>
-              <a:graphicFrameLocks xmlns:a="http://schemas.openxmlformats.org/drawingml/2006/main" noChangeAspect="1"/>
-            </wp:cNvGraphicFramePr>
-            <a:graphic xmlns:a="http://schemas.openxmlformats.org/drawingml/2006/main">
-              <a:graphicData uri="http://schemas.openxmlformats.org/drawingml/2006/picture">
-                <pic:pic xmlns:pic="http://schemas.openxmlformats.org/drawingml/2006/picture">
-                  <pic:nvPicPr>
-                    <pic:cNvPr id="476529727" name=""/>
-                    <pic:cNvPicPr/>
-                  </pic:nvPicPr>
-                  <pic:blipFill>
-                    <a:blip r:embed="rId5">
-                      <a:extLst>
-                        <a:ext uri="{96DAC541-7B7A-43D3-8B79-37D633B846F1}">
-                          <asvg:svgBlip xmlns:asvg="http://schemas.microsoft.com/office/drawing/2016/SVG/main" r:embed="rId6"/>
-                        </a:ext>
-                      </a:extLst>
-                    </a:blip>
-                    <a:stretch>
-                      <a:fillRect/>
-                    </a:stretch>
-                  </pic:blipFill>
-                  <pic:spPr>
-                    <a:xfrm>
-                      <a:off x="0" y="0"/>
-                      <a:ext cx="2794000" cy="1303867"/>
-                    </a:xfrm>
-                    <a:prstGeom prst="rect">
-                      <a:avLst/>
-                    </a:prstGeom>
-                  </pic:spPr>
-                </pic:pic>
-              </a:graphicData>
-            </a:graphic>
-          </wp:inline>
-        </w:drawing>
+        <w:t xml:space="preserve"> </w:t>
+      </w:r>
+      <w:proofErr w:type="spellStart"/>
+      <w:r>
+        <w:rPr>
+          <w:rFonts w:hint="cs"/>
+          <w:sz w:val="28"/>
+          <w:szCs w:val="28"/>
+          <w:cs/>
+          <w:lang w:bidi="hi-IN"/>
+        </w:rPr>
+        <w:t>दुनिया</w:t>
+      </w:r>
+      <w:r>
+        <w:rPr>
+          <w:rFonts w:hint="cs"/>
+          <w:sz w:val="28"/>
+          <w:szCs w:val="28"/>
+          <w:cs/>
+          <w:lang w:bidi="hi-IN"/>
+        </w:rPr>
+        <w:t>भर</w:t>
+      </w:r>
+      <w:proofErr w:type="spellEnd"/>
+      <w:r>
+        <w:rPr>
+          <w:rFonts w:hint="cs"/>
+          <w:sz w:val="28"/>
+          <w:szCs w:val="28"/>
+          <w:cs/>
+          <w:lang w:bidi="hi-IN"/>
+        </w:rPr>
+        <w:t xml:space="preserve"> से</w:t>
+      </w:r>
+      <w:r>
+        <w:rPr>
+          <w:rFonts w:hint="cs"/>
+          <w:sz w:val="28"/>
+          <w:szCs w:val="28"/>
+          <w:cs/>
+          <w:lang w:bidi="hi-IN"/>
+        </w:rPr>
+        <w:t xml:space="preserve"> कई देशों </w:t>
+      </w:r>
+      <w:r>
+        <w:rPr>
+          <w:rFonts w:hint="cs"/>
+          <w:sz w:val="28"/>
+          <w:szCs w:val="28"/>
+          <w:cs/>
+          <w:lang w:bidi="hi-IN"/>
+        </w:rPr>
+        <w:t>की</w:t>
+      </w:r>
+      <w:r>
+        <w:rPr>
+          <w:rFonts w:hint="cs"/>
+          <w:sz w:val="28"/>
+          <w:szCs w:val="28"/>
+          <w:cs/>
+          <w:lang w:bidi="hi-IN"/>
+        </w:rPr>
+        <w:t xml:space="preserve"> </w:t>
+      </w:r>
+      <w:r>
+        <w:rPr>
+          <w:rFonts w:hint="cs"/>
+          <w:sz w:val="28"/>
+          <w:szCs w:val="28"/>
+          <w:cs/>
+          <w:lang w:bidi="hi-IN"/>
+        </w:rPr>
+        <w:t xml:space="preserve">इस </w:t>
+      </w:r>
+      <w:r>
+        <w:rPr>
+          <w:rFonts w:hint="cs"/>
+          <w:sz w:val="28"/>
+          <w:szCs w:val="28"/>
+          <w:cs/>
+          <w:lang w:bidi="hi-IN"/>
+        </w:rPr>
+        <w:t>संकल्पना</w:t>
+      </w:r>
+      <w:r>
+        <w:rPr>
+          <w:rFonts w:hint="cs"/>
+          <w:sz w:val="28"/>
+          <w:szCs w:val="28"/>
+          <w:cs/>
+          <w:lang w:bidi="hi-IN"/>
+        </w:rPr>
+        <w:t xml:space="preserve"> पर </w:t>
+      </w:r>
+      <w:r>
+        <w:rPr>
+          <w:rFonts w:hint="cs"/>
+          <w:sz w:val="28"/>
+          <w:szCs w:val="28"/>
+          <w:cs/>
+          <w:lang w:bidi="hi-IN"/>
+        </w:rPr>
+        <w:t xml:space="preserve">बनी </w:t>
+      </w:r>
+      <w:r>
+        <w:rPr>
+          <w:rFonts w:hint="cs"/>
+          <w:sz w:val="28"/>
+          <w:szCs w:val="28"/>
+          <w:cs/>
+          <w:lang w:bidi="hi-IN"/>
+        </w:rPr>
+        <w:t xml:space="preserve">प्रदर्शनियों </w:t>
+      </w:r>
+      <w:r>
+        <w:rPr>
+          <w:rFonts w:hint="cs"/>
+          <w:sz w:val="28"/>
+          <w:szCs w:val="28"/>
+          <w:cs/>
+          <w:lang w:bidi="hi-IN"/>
+        </w:rPr>
+        <w:t xml:space="preserve">लाखों को आकर्षित </w:t>
+      </w:r>
+      <w:r>
+        <w:rPr>
+          <w:rFonts w:hint="cs"/>
+          <w:sz w:val="28"/>
+          <w:szCs w:val="28"/>
+          <w:cs/>
+          <w:lang w:bidi="hi-IN"/>
+        </w:rPr>
+        <w:t>कर चुकी है।</w:t>
+      </w:r>
+      <w:r>
+        <w:rPr>
+          <w:rFonts w:hint="cs"/>
+          <w:sz w:val="28"/>
+          <w:szCs w:val="28"/>
+          <w:cs/>
+          <w:lang w:bidi="hi-IN"/>
+        </w:rPr>
+        <w:t xml:space="preserve"> </w:t>
+      </w:r>
+      <w:r>
+        <w:rPr>
+          <w:rFonts w:hint="cs"/>
+          <w:sz w:val="28"/>
+          <w:szCs w:val="28"/>
+          <w:cs/>
+          <w:lang w:bidi="hi-IN"/>
+        </w:rPr>
+        <w:t>वैश्विक</w:t>
+      </w:r>
+      <w:r>
+        <w:rPr>
+          <w:rFonts w:hint="cs"/>
+          <w:sz w:val="28"/>
+          <w:szCs w:val="28"/>
+          <w:cs/>
+          <w:lang w:bidi="hi-IN"/>
+        </w:rPr>
+        <w:t xml:space="preserve"> </w:t>
+      </w:r>
+      <w:r>
+        <w:rPr>
+          <w:rFonts w:hint="cs"/>
+          <w:sz w:val="28"/>
+          <w:szCs w:val="28"/>
+          <w:cs/>
+          <w:lang w:bidi="hi-IN"/>
+        </w:rPr>
+        <w:t>लोकप्रियता</w:t>
+      </w:r>
+      <w:r>
+        <w:rPr>
+          <w:rFonts w:hint="cs"/>
+          <w:sz w:val="28"/>
+          <w:szCs w:val="28"/>
+          <w:cs/>
+          <w:lang w:bidi="hi-IN"/>
+        </w:rPr>
+        <w:t xml:space="preserve"> </w:t>
+      </w:r>
+      <w:r>
+        <w:rPr>
+          <w:rFonts w:hint="cs"/>
+          <w:sz w:val="28"/>
+          <w:szCs w:val="28"/>
+          <w:cs/>
+          <w:lang w:bidi="hi-IN"/>
+        </w:rPr>
+        <w:t xml:space="preserve">में </w:t>
+      </w:r>
+      <w:r>
+        <w:rPr>
+          <w:rFonts w:hint="cs"/>
+          <w:sz w:val="28"/>
+          <w:szCs w:val="28"/>
+          <w:cs/>
+          <w:lang w:bidi="hi-IN"/>
+        </w:rPr>
+        <w:t>‘</w:t>
+      </w:r>
+      <w:r>
+        <w:rPr>
+          <w:rFonts w:hint="cs"/>
+          <w:sz w:val="28"/>
+          <w:szCs w:val="28"/>
+          <w:cs/>
+          <w:lang w:bidi="hi-IN"/>
+        </w:rPr>
+        <w:t>टीम लैब</w:t>
+      </w:r>
+      <w:r>
+        <w:rPr>
+          <w:rFonts w:hint="cs"/>
+          <w:sz w:val="28"/>
+          <w:szCs w:val="28"/>
+          <w:cs/>
+          <w:lang w:bidi="hi-IN"/>
+        </w:rPr>
+        <w:t>’</w:t>
+      </w:r>
+      <w:r>
+        <w:rPr>
+          <w:rFonts w:hint="cs"/>
+          <w:sz w:val="28"/>
+          <w:szCs w:val="28"/>
+          <w:cs/>
+          <w:lang w:bidi="hi-IN"/>
+        </w:rPr>
+        <w:t xml:space="preserve"> </w:t>
+      </w:r>
+      <w:r>
+        <w:rPr>
+          <w:rFonts w:hint="cs"/>
+          <w:sz w:val="28"/>
+          <w:szCs w:val="28"/>
+          <w:cs/>
+          <w:lang w:bidi="hi-IN"/>
+        </w:rPr>
+        <w:t xml:space="preserve">को </w:t>
+      </w:r>
+      <w:r>
+        <w:rPr>
+          <w:rFonts w:hint="cs"/>
+          <w:sz w:val="28"/>
+          <w:szCs w:val="28"/>
+          <w:cs/>
+          <w:lang w:bidi="hi-IN"/>
+        </w:rPr>
+        <w:t xml:space="preserve">एक </w:t>
+      </w:r>
+      <w:r>
+        <w:rPr>
+          <w:rFonts w:hint="cs"/>
+          <w:sz w:val="28"/>
+          <w:szCs w:val="28"/>
+          <w:cs/>
+          <w:lang w:bidi="hi-IN"/>
+        </w:rPr>
+        <w:t>विश्वव्यापी</w:t>
+      </w:r>
+      <w:r>
+        <w:rPr>
+          <w:rFonts w:hint="cs"/>
+          <w:sz w:val="28"/>
+          <w:szCs w:val="28"/>
+          <w:cs/>
+          <w:lang w:bidi="hi-IN"/>
+        </w:rPr>
+        <w:t xml:space="preserve"> </w:t>
+      </w:r>
+      <w:r>
+        <w:rPr>
+          <w:rFonts w:hint="cs"/>
+          <w:sz w:val="28"/>
+          <w:szCs w:val="28"/>
+          <w:cs/>
+          <w:lang w:bidi="hi-IN"/>
+        </w:rPr>
+        <w:t>ट्रे</w:t>
+      </w:r>
+      <w:r>
+        <w:rPr>
+          <w:rFonts w:hint="cs"/>
+          <w:sz w:val="28"/>
+          <w:szCs w:val="28"/>
+          <w:cs/>
+          <w:lang w:bidi="hi-IN"/>
+        </w:rPr>
+        <w:t>ं</w:t>
+      </w:r>
+      <w:r>
+        <w:rPr>
+          <w:rFonts w:hint="cs"/>
+          <w:sz w:val="28"/>
+          <w:szCs w:val="28"/>
+          <w:cs/>
+          <w:lang w:bidi="hi-IN"/>
+        </w:rPr>
+        <w:t>ड</w:t>
+      </w:r>
+      <w:r>
+        <w:rPr>
+          <w:rFonts w:hint="cs"/>
+          <w:sz w:val="28"/>
+          <w:szCs w:val="28"/>
+          <w:cs/>
+          <w:lang w:bidi="hi-IN"/>
+        </w:rPr>
+        <w:t xml:space="preserve"> </w:t>
+      </w:r>
+      <w:r>
+        <w:rPr>
+          <w:rFonts w:hint="cs"/>
+          <w:sz w:val="28"/>
+          <w:szCs w:val="28"/>
+          <w:cs/>
+          <w:lang w:bidi="hi-IN"/>
+        </w:rPr>
+        <w:t>का दर्जा</w:t>
+      </w:r>
+      <w:r>
+        <w:rPr>
+          <w:rFonts w:hint="cs"/>
+          <w:sz w:val="28"/>
+          <w:szCs w:val="28"/>
+          <w:cs/>
+          <w:lang w:bidi="hi-IN"/>
+        </w:rPr>
+        <w:t xml:space="preserve"> </w:t>
+      </w:r>
+      <w:r>
+        <w:rPr>
+          <w:rFonts w:hint="cs"/>
+          <w:sz w:val="28"/>
+          <w:szCs w:val="28"/>
+          <w:cs/>
+          <w:lang w:bidi="hi-IN"/>
+        </w:rPr>
+        <w:t>प्राप्त</w:t>
+      </w:r>
+      <w:r>
+        <w:rPr>
+          <w:rFonts w:hint="cs"/>
+          <w:sz w:val="28"/>
+          <w:szCs w:val="28"/>
+          <w:cs/>
+          <w:lang w:bidi="hi-IN"/>
+        </w:rPr>
+        <w:t xml:space="preserve"> </w:t>
+      </w:r>
+      <w:r>
+        <w:rPr>
+          <w:rFonts w:hint="cs"/>
+          <w:sz w:val="28"/>
+          <w:szCs w:val="28"/>
+          <w:cs/>
+          <w:lang w:bidi="hi-IN"/>
+        </w:rPr>
+        <w:t>है।</w:t>
+      </w:r>
+      <w:r>
+        <w:rPr>
+          <w:rFonts w:hint="cs"/>
+          <w:sz w:val="28"/>
+          <w:szCs w:val="28"/>
+          <w:cs/>
+          <w:lang w:bidi="hi-IN"/>
+        </w:rPr>
+        <w:t xml:space="preserve"> </w:t>
+      </w:r>
+      <w:r>
+        <w:rPr>
+          <w:rFonts w:hint="cs"/>
+          <w:sz w:val="28"/>
+          <w:szCs w:val="28"/>
+          <w:cs/>
+          <w:lang w:bidi="hi-IN"/>
+        </w:rPr>
+        <w:t>इन</w:t>
+      </w:r>
+      <w:r>
+        <w:rPr>
+          <w:rFonts w:hint="cs"/>
+          <w:sz w:val="28"/>
+          <w:szCs w:val="28"/>
+          <w:cs/>
+          <w:lang w:bidi="hi-IN"/>
+        </w:rPr>
+        <w:t xml:space="preserve"> </w:t>
+      </w:r>
+      <w:r>
+        <w:rPr>
+          <w:rFonts w:hint="cs"/>
+          <w:sz w:val="28"/>
+          <w:szCs w:val="28"/>
+          <w:cs/>
+          <w:lang w:bidi="hi-IN"/>
+        </w:rPr>
+        <w:t>क</w:t>
+      </w:r>
+      <w:r>
+        <w:rPr>
+          <w:rFonts w:hint="cs"/>
+          <w:sz w:val="28"/>
+          <w:szCs w:val="28"/>
+          <w:cs/>
+          <w:lang w:bidi="hi-IN"/>
+        </w:rPr>
+        <w:t xml:space="preserve">ला </w:t>
+      </w:r>
+      <w:r>
+        <w:rPr>
+          <w:rFonts w:hint="cs"/>
+          <w:sz w:val="28"/>
+          <w:szCs w:val="28"/>
+          <w:cs/>
+          <w:lang w:bidi="hi-IN"/>
+        </w:rPr>
+        <w:t>संग्रहालयों</w:t>
+      </w:r>
+      <w:r>
+        <w:rPr>
+          <w:rFonts w:hint="cs"/>
+          <w:sz w:val="28"/>
+          <w:szCs w:val="28"/>
+          <w:cs/>
+          <w:lang w:bidi="hi-IN"/>
+        </w:rPr>
+        <w:t xml:space="preserve"> क</w:t>
+      </w:r>
+      <w:r>
+        <w:rPr>
+          <w:rFonts w:hint="cs"/>
+          <w:sz w:val="28"/>
+          <w:szCs w:val="28"/>
+          <w:cs/>
+          <w:lang w:bidi="hi-IN"/>
+        </w:rPr>
+        <w:t>ा</w:t>
+      </w:r>
+      <w:r>
+        <w:rPr>
+          <w:rFonts w:hint="cs"/>
+          <w:sz w:val="28"/>
+          <w:szCs w:val="28"/>
+          <w:cs/>
+          <w:lang w:bidi="hi-IN"/>
+        </w:rPr>
+        <w:t xml:space="preserve"> </w:t>
+      </w:r>
+      <w:r>
+        <w:rPr>
+          <w:rFonts w:hint="cs"/>
+          <w:sz w:val="28"/>
+          <w:szCs w:val="28"/>
+          <w:cs/>
+          <w:lang w:bidi="hi-IN"/>
+        </w:rPr>
+        <w:t xml:space="preserve">असाधारण योगदान </w:t>
+      </w:r>
+      <w:r>
+        <w:rPr>
+          <w:rFonts w:hint="cs"/>
+          <w:sz w:val="28"/>
+          <w:szCs w:val="28"/>
+          <w:cs/>
+          <w:lang w:bidi="hi-IN"/>
+        </w:rPr>
+        <w:t>ही इसकी</w:t>
+      </w:r>
+      <w:r>
+        <w:rPr>
+          <w:rFonts w:hint="cs"/>
+          <w:sz w:val="28"/>
+          <w:szCs w:val="28"/>
+          <w:cs/>
+          <w:lang w:bidi="hi-IN"/>
+        </w:rPr>
+        <w:t xml:space="preserve"> </w:t>
+      </w:r>
+      <w:r>
+        <w:rPr>
+          <w:rFonts w:hint="cs"/>
+          <w:sz w:val="28"/>
+          <w:szCs w:val="28"/>
+          <w:cs/>
+          <w:lang w:bidi="hi-IN"/>
+        </w:rPr>
+        <w:t>उपलब्धि</w:t>
+      </w:r>
+      <w:r>
+        <w:rPr>
+          <w:rFonts w:hint="cs"/>
+          <w:sz w:val="28"/>
+          <w:szCs w:val="28"/>
+          <w:cs/>
+          <w:lang w:bidi="hi-IN"/>
+        </w:rPr>
+        <w:t xml:space="preserve"> </w:t>
+      </w:r>
+      <w:r>
+        <w:rPr>
+          <w:rFonts w:hint="cs"/>
+          <w:sz w:val="28"/>
+          <w:szCs w:val="28"/>
+          <w:cs/>
+          <w:lang w:bidi="hi-IN"/>
+        </w:rPr>
+        <w:t>व</w:t>
+      </w:r>
+      <w:r>
+        <w:rPr>
+          <w:rFonts w:hint="cs"/>
+          <w:sz w:val="28"/>
+          <w:szCs w:val="28"/>
+          <w:cs/>
+          <w:lang w:bidi="hi-IN"/>
+        </w:rPr>
+        <w:t xml:space="preserve"> </w:t>
+      </w:r>
+      <w:r>
+        <w:rPr>
+          <w:rFonts w:hint="cs"/>
+          <w:sz w:val="28"/>
+          <w:szCs w:val="28"/>
+          <w:cs/>
+          <w:lang w:bidi="hi-IN"/>
+        </w:rPr>
+        <w:t>खासियत है</w:t>
+      </w:r>
+      <w:r>
+        <w:rPr>
+          <w:rFonts w:hint="cs"/>
+          <w:sz w:val="28"/>
+          <w:szCs w:val="28"/>
+          <w:cs/>
+          <w:lang w:bidi="hi-IN"/>
+        </w:rPr>
+        <w:t>।</w:t>
       </w:r>
     </w:p>
     <w:p>
       <w:pPr>
-        <w:jc w:val="right"/>
         <w:rPr>
           <w:b/>
           <w:bCs/>

</xml_diff>